<commit_message>
Ajout du répertoire des files d'attente
</commit_message>
<xml_diff>
--- a/11. Solveurs linéaires/9. DOCUMENTATIONS/Francais/Cours/01. Traduction d'un bon manuel de www.ufrgs.br.docx
+++ b/11. Solveurs linéaires/9. DOCUMENTATIONS/Francais/Cours/01. Traduction d'un bon manuel de www.ufrgs.br.docx
@@ -4934,19 +4934,7 @@
         </w:tabs>
       </w:pPr>
       <w:r>
-        <w:t>Pour atteindre ces groupes, Dorian Auto</w:t>
-      </w:r>
-      <w:r>
-        <w:t xml:space="preserve"> </w:t>
-      </w:r>
-      <w:r>
-        <w:t>s'est lancé dans une campagne publicitaire télévisée ambitieuse et a décidé d'acheter</w:t>
-      </w:r>
-      <w:r>
-        <w:t xml:space="preserve"> Des </w:t>
-      </w:r>
-      <w:r>
-        <w:t xml:space="preserve">Spots commerciaux d'une minute sur deux types de </w:t>
+        <w:t xml:space="preserve">Pour atteindre ces groupes, Dorian Auto s'est lancé dans une campagne publicitaire télévisée ambitieuse et a décidé d'acheter Des Spots commerciaux d'une minute sur deux types de </w:t>
       </w:r>
       <w:proofErr w:type="gramStart"/>
       <w:r>
@@ -4964,37 +4952,7 @@
         </w:tabs>
       </w:pPr>
       <w:r>
-        <w:t>Chaque publicité comique est vue par 7 millions de femmes à revenu élevé et 2 millions d'hommes à revenu élevé. Chaque publicité de football est vue par 2 millions de femmes à revenu élevé et 12</w:t>
-      </w:r>
-      <w:r>
-        <w:t xml:space="preserve"> </w:t>
-      </w:r>
-      <w:r>
-        <w:t>millions d’hommes à revenu élevé. Une annonce comique d'une minute coûte 50</w:t>
-      </w:r>
-      <w:r>
-        <w:t xml:space="preserve"> </w:t>
-      </w:r>
-      <w:r>
-        <w:t xml:space="preserve">000 $ et </w:t>
-      </w:r>
-      <w:r>
-        <w:t>en</w:t>
-      </w:r>
-      <w:r>
-        <w:t xml:space="preserve"> football l'annonce</w:t>
-      </w:r>
-      <w:r>
-        <w:t xml:space="preserve"> d’une minute</w:t>
-      </w:r>
-      <w:r>
-        <w:t xml:space="preserve"> coûte 100 000 $. Dorian aimerait que les publicités soient vues par au moins 28 millions de personnes</w:t>
-      </w:r>
-      <w:r>
-        <w:t xml:space="preserve"> </w:t>
-      </w:r>
-      <w:r>
-        <w:t>femmes à revenu élevé et 24 millions d’hommes à revenu élevé.</w:t>
+        <w:t>Chaque publicité comique est vue par 7 millions de femmes à revenu élevé et 2 millions d'hommes à revenu élevé. Chaque publicité de football est vue par 2 millions de femmes à revenu élevé et 12 millions d’hommes à revenu élevé. Une annonce comique d'une minute coûte 50 000 $ et en football l'annonce d’une minute coûte 100 000 $. Dorian aimerait que les publicités soient vues par au moins 28 millions de personnes femmes à revenu élevé et 24 millions d’hommes à revenu élevé.</w:t>
       </w:r>
     </w:p>
     <w:p>
@@ -5126,13 +5084,7 @@
       </w:r>
       <w:proofErr w:type="gramEnd"/>
       <w:r>
-        <w:t xml:space="preserve"> z </w:t>
-      </w:r>
-      <w:r>
-        <w:t>=</w:t>
-      </w:r>
-      <w:r>
-        <w:t xml:space="preserve"> 50x1 </w:t>
+        <w:t xml:space="preserve"> z = 50x1 </w:t>
       </w:r>
       <w:r>
         <w:t>+</w:t>
@@ -5200,19 +5152,7 @@
         </w:tabs>
       </w:pPr>
       <w:r>
-        <w:t xml:space="preserve">7x1 </w:t>
-      </w:r>
-      <w:r>
-        <w:t>+</w:t>
-      </w:r>
-      <w:r>
-        <w:t xml:space="preserve"> 2x2 </w:t>
-      </w:r>
-      <w:r>
-        <w:t>=</w:t>
-      </w:r>
-      <w:r>
-        <w:t xml:space="preserve"> 28 </w:t>
+        <w:t xml:space="preserve">7x1 + 2x2 = 28 </w:t>
       </w:r>
     </w:p>
     <w:p>
@@ -5232,19 +5172,7 @@
         </w:tabs>
       </w:pPr>
       <w:r>
-        <w:t xml:space="preserve">2x1 </w:t>
-      </w:r>
-      <w:r>
-        <w:t>+</w:t>
-      </w:r>
-      <w:r>
-        <w:t xml:space="preserve">12x2 </w:t>
-      </w:r>
-      <w:r>
-        <w:t>=</w:t>
-      </w:r>
-      <w:r>
-        <w:t xml:space="preserve"> 24</w:t>
+        <w:t>2x1 +12x2 = 24</w:t>
       </w:r>
     </w:p>
     <w:p>
@@ -5279,13 +5207,15 @@
       </w:r>
       <w:proofErr w:type="spellEnd"/>
       <w:r>
-        <w:t xml:space="preserve"> restrictions x1 </w:t>
-      </w:r>
-      <w:r>
-        <w:t xml:space="preserve"> 0 and x2 </w:t>
-      </w:r>
-      <w:r>
-        <w:t xml:space="preserve"> 0 are </w:t>
+        <w:t xml:space="preserve"> restrictions x</w:t>
+      </w:r>
+      <w:proofErr w:type="gramStart"/>
+      <w:r>
+        <w:t>1  0</w:t>
+      </w:r>
+      <w:proofErr w:type="gramEnd"/>
+      <w:r>
+        <w:t xml:space="preserve"> and x2  0 are </w:t>
       </w:r>
       <w:proofErr w:type="spellStart"/>
       <w:r>
@@ -5317,15 +5247,7 @@
       </w:r>
       <w:proofErr w:type="spellEnd"/>
       <w:r>
-        <w:t xml:space="preserve"> </w:t>
-      </w:r>
-      <w:proofErr w:type="gramStart"/>
-      <w:r>
-        <w:t>by:</w:t>
-      </w:r>
-      <w:proofErr w:type="gramEnd"/>
-      <w:r>
-        <w:t xml:space="preserve"> </w:t>
+        <w:t xml:space="preserve"> by: </w:t>
       </w:r>
     </w:p>
     <w:p>
@@ -5508,17 +5430,11 @@
       <w:proofErr w:type="spellStart"/>
       <w:proofErr w:type="gramStart"/>
       <w:r>
-        <w:t>problème</w:t>
-      </w:r>
-      <w:r>
-        <w:t>de</w:t>
+        <w:t>problèmede</w:t>
       </w:r>
       <w:proofErr w:type="spellEnd"/>
       <w:r>
-        <w:t xml:space="preserve"> </w:t>
-      </w:r>
-      <w:r>
-        <w:t xml:space="preserve"> dorien</w:t>
+        <w:t xml:space="preserve">  dorien</w:t>
       </w:r>
       <w:proofErr w:type="gramEnd"/>
       <w:r>
@@ -5789,6 +5705,45 @@
       <w:r>
         <w:t>)</w:t>
       </w:r>
+    </w:p>
+    <w:p>
+      <w:pPr>
+        <w:tabs>
+          <w:tab w:val="left" w:pos="2076"/>
+        </w:tabs>
+      </w:pPr>
+    </w:p>
+    <w:p>
+      <w:pPr>
+        <w:tabs>
+          <w:tab w:val="left" w:pos="2076"/>
+        </w:tabs>
+      </w:pPr>
+      <w:r>
+        <w:t xml:space="preserve">Rectification : Je ne </w:t>
+      </w:r>
+      <w:proofErr w:type="gramStart"/>
+      <w:r>
+        <w:t>traduit</w:t>
+      </w:r>
+      <w:proofErr w:type="gramEnd"/>
+      <w:r>
+        <w:t xml:space="preserve"> que les meilleurs passages ou les plus importants.</w:t>
+      </w:r>
+    </w:p>
+    <w:p>
+      <w:pPr>
+        <w:tabs>
+          <w:tab w:val="left" w:pos="2076"/>
+        </w:tabs>
+      </w:pPr>
+    </w:p>
+    <w:p>
+      <w:pPr>
+        <w:tabs>
+          <w:tab w:val="left" w:pos="2076"/>
+        </w:tabs>
+      </w:pPr>
     </w:p>
     <w:sectPr>
       <w:pgSz w:w="11906" w:h="16838"/>

</xml_diff>

<commit_message>
Mise à jour des docs !
</commit_message>
<xml_diff>
--- a/11. Solveurs linéaires/9. DOCUMENTATIONS/Francais/Cours/01. Traduction d'un bon manuel de www.ufrgs.br.docx
+++ b/11. Solveurs linéaires/9. DOCUMENTATIONS/Francais/Cours/01. Traduction d'un bon manuel de www.ufrgs.br.docx
@@ -5425,16 +5425,14 @@
       </w:r>
       <w:proofErr w:type="spellEnd"/>
       <w:r>
-        <w:t xml:space="preserve">, le </w:t>
-      </w:r>
-      <w:proofErr w:type="spellStart"/>
-      <w:proofErr w:type="gramStart"/>
-      <w:r>
-        <w:t>problèmede</w:t>
-      </w:r>
-      <w:proofErr w:type="spellEnd"/>
-      <w:r>
-        <w:t xml:space="preserve">  dorien</w:t>
+        <w:t>, le problème</w:t>
+      </w:r>
+      <w:r>
+        <w:t xml:space="preserve"> </w:t>
+      </w:r>
+      <w:proofErr w:type="gramStart"/>
+      <w:r>
+        <w:t>de  dorien</w:t>
       </w:r>
       <w:proofErr w:type="gramEnd"/>
       <w:r>
@@ -5718,25 +5716,3074 @@
         <w:tabs>
           <w:tab w:val="left" w:pos="2076"/>
         </w:tabs>
-      </w:pPr>
-      <w:r>
-        <w:t xml:space="preserve">Rectification : Je ne </w:t>
-      </w:r>
-      <w:proofErr w:type="gramStart"/>
-      <w:r>
-        <w:t>traduit</w:t>
-      </w:r>
-      <w:proofErr w:type="gramEnd"/>
-      <w:r>
-        <w:t xml:space="preserve"> que les meilleurs passages ou les plus importants.</w:t>
-      </w:r>
-    </w:p>
-    <w:p>
-      <w:pPr>
-        <w:tabs>
-          <w:tab w:val="left" w:pos="2076"/>
-        </w:tabs>
-      </w:pPr>
+        <w:rPr>
+          <w:b/>
+          <w:bCs/>
+        </w:rPr>
+      </w:pPr>
+      <w:r>
+        <w:rPr>
+          <w:b/>
+          <w:bCs/>
+        </w:rPr>
+        <w:t>Rectification : Je ne tradui</w:t>
+      </w:r>
+      <w:r>
+        <w:rPr>
+          <w:b/>
+          <w:bCs/>
+        </w:rPr>
+        <w:t xml:space="preserve">s </w:t>
+      </w:r>
+      <w:r>
+        <w:rPr>
+          <w:b/>
+          <w:bCs/>
+        </w:rPr>
+        <w:t>que les meilleurs passages ou les plus importants.</w:t>
+      </w:r>
+    </w:p>
+    <w:p>
+      <w:pPr>
+        <w:tabs>
+          <w:tab w:val="left" w:pos="2076"/>
+        </w:tabs>
+      </w:pPr>
+    </w:p>
+    <w:p>
+      <w:pPr>
+        <w:pStyle w:val="Titre1"/>
+      </w:pPr>
+      <w:r>
+        <w:t>Example 6 : un problème de régime.</w:t>
+      </w:r>
+    </w:p>
+    <w:p/>
+    <w:p>
+      <w:pPr>
+        <w:tabs>
+          <w:tab w:val="left" w:pos="2076"/>
+        </w:tabs>
+      </w:pPr>
+      <w:r>
+        <w:t>Mon alimentation exige que toute la nourriture que je mange provienne de l'un des quatre</w:t>
+      </w:r>
+      <w:proofErr w:type="gramStart"/>
+      <w:r>
+        <w:t xml:space="preserve"> «groupes</w:t>
+      </w:r>
+      <w:proofErr w:type="gramEnd"/>
+      <w:r>
+        <w:t xml:space="preserve"> alimentaires de base»(gâteau au chocolat, crème glacée, soda et cheesecake). </w:t>
+      </w:r>
+    </w:p>
+    <w:p>
+      <w:pPr>
+        <w:tabs>
+          <w:tab w:val="left" w:pos="2076"/>
+        </w:tabs>
+      </w:pPr>
+      <w:r>
+        <w:t>À l'heure actuelle, les quatre aliments suivants</w:t>
+      </w:r>
+      <w:r>
+        <w:t xml:space="preserve"> </w:t>
+      </w:r>
+      <w:r>
+        <w:t xml:space="preserve">sont disponibles à la </w:t>
+      </w:r>
+      <w:proofErr w:type="gramStart"/>
+      <w:r>
+        <w:t>conso</w:t>
+      </w:r>
+      <w:r>
+        <w:t>m</w:t>
+      </w:r>
+      <w:r>
+        <w:t>mation:</w:t>
+      </w:r>
+      <w:proofErr w:type="gramEnd"/>
+      <w:r>
+        <w:t xml:space="preserve"> </w:t>
+      </w:r>
+    </w:p>
+    <w:p>
+      <w:pPr>
+        <w:pStyle w:val="Paragraphedeliste"/>
+        <w:numPr>
+          <w:ilvl w:val="0"/>
+          <w:numId w:val="2"/>
+        </w:numPr>
+        <w:tabs>
+          <w:tab w:val="left" w:pos="2076"/>
+        </w:tabs>
+      </w:pPr>
+      <w:proofErr w:type="gramStart"/>
+      <w:r>
+        <w:t>brownies</w:t>
+      </w:r>
+      <w:proofErr w:type="gramEnd"/>
+      <w:r>
+        <w:t xml:space="preserve">, </w:t>
+      </w:r>
+    </w:p>
+    <w:p>
+      <w:pPr>
+        <w:pStyle w:val="Paragraphedeliste"/>
+        <w:numPr>
+          <w:ilvl w:val="0"/>
+          <w:numId w:val="2"/>
+        </w:numPr>
+        <w:tabs>
+          <w:tab w:val="left" w:pos="2076"/>
+        </w:tabs>
+      </w:pPr>
+      <w:proofErr w:type="gramStart"/>
+      <w:r>
+        <w:t>glace</w:t>
+      </w:r>
+      <w:proofErr w:type="gramEnd"/>
+      <w:r>
+        <w:t xml:space="preserve"> au chocolat, </w:t>
+      </w:r>
+    </w:p>
+    <w:p>
+      <w:pPr>
+        <w:pStyle w:val="Paragraphedeliste"/>
+        <w:numPr>
+          <w:ilvl w:val="0"/>
+          <w:numId w:val="2"/>
+        </w:numPr>
+        <w:tabs>
+          <w:tab w:val="left" w:pos="2076"/>
+        </w:tabs>
+      </w:pPr>
+      <w:proofErr w:type="gramStart"/>
+      <w:r>
+        <w:t>cola</w:t>
+      </w:r>
+      <w:proofErr w:type="gramEnd"/>
+      <w:r>
+        <w:t xml:space="preserve"> et </w:t>
+      </w:r>
+    </w:p>
+    <w:p>
+      <w:pPr>
+        <w:pStyle w:val="Paragraphedeliste"/>
+        <w:numPr>
+          <w:ilvl w:val="0"/>
+          <w:numId w:val="2"/>
+        </w:numPr>
+        <w:tabs>
+          <w:tab w:val="left" w:pos="2076"/>
+        </w:tabs>
+      </w:pPr>
+      <w:proofErr w:type="gramStart"/>
+      <w:r>
+        <w:t>gâteau</w:t>
+      </w:r>
+      <w:proofErr w:type="gramEnd"/>
+      <w:r>
+        <w:t xml:space="preserve"> au fromage à l'ananas. </w:t>
+      </w:r>
+    </w:p>
+    <w:p>
+      <w:pPr>
+        <w:tabs>
+          <w:tab w:val="left" w:pos="2076"/>
+        </w:tabs>
+      </w:pPr>
+      <w:r>
+        <w:t xml:space="preserve">Chaque brownie coûte </w:t>
+      </w:r>
+      <w:r>
+        <w:rPr>
+          <w:b/>
+          <w:bCs/>
+        </w:rPr>
+        <w:t>50 ¢</w:t>
+      </w:r>
+      <w:r>
+        <w:t xml:space="preserve">, chaque boule de glace au chocolat coûte </w:t>
+      </w:r>
+      <w:r>
+        <w:rPr>
+          <w:b/>
+          <w:bCs/>
+        </w:rPr>
+        <w:t>20 ¢</w:t>
+      </w:r>
+      <w:r>
+        <w:t>, chaque bouteille</w:t>
+      </w:r>
+      <w:r>
+        <w:t xml:space="preserve"> </w:t>
+      </w:r>
+      <w:r>
+        <w:t xml:space="preserve">de cola coûte </w:t>
+      </w:r>
+      <w:r>
+        <w:rPr>
+          <w:b/>
+          <w:bCs/>
+        </w:rPr>
+        <w:t>30 ¢</w:t>
+      </w:r>
+      <w:r>
+        <w:t xml:space="preserve">, et chaque morceau de gâteau au fromage à l'ananas coûte </w:t>
+      </w:r>
+      <w:r>
+        <w:rPr>
+          <w:b/>
+          <w:bCs/>
+        </w:rPr>
+        <w:t>80 ¢</w:t>
+      </w:r>
+      <w:r>
+        <w:t xml:space="preserve">. </w:t>
+      </w:r>
+    </w:p>
+    <w:p>
+      <w:pPr>
+        <w:tabs>
+          <w:tab w:val="left" w:pos="2076"/>
+        </w:tabs>
+      </w:pPr>
+      <w:r>
+        <w:t xml:space="preserve">Chaque jour, je dois faire au moins </w:t>
+      </w:r>
+      <w:r>
+        <w:rPr>
+          <w:b/>
+          <w:bCs/>
+        </w:rPr>
+        <w:t>500 calories, 6 onces de chocolat, 10 onces de sucre et 8 onces de matières grasses</w:t>
+      </w:r>
+      <w:r>
+        <w:t xml:space="preserve">. La teneur nutritionnelle par unité de chaque aliment est indiquée dans le tableau 2. </w:t>
+      </w:r>
+    </w:p>
+    <w:p>
+      <w:pPr>
+        <w:tabs>
+          <w:tab w:val="left" w:pos="2076"/>
+        </w:tabs>
+      </w:pPr>
+      <w:r>
+        <w:lastRenderedPageBreak/>
+        <w:t>Formuler une programmation linéaire</w:t>
+      </w:r>
+      <w:r>
+        <w:t xml:space="preserve"> </w:t>
+      </w:r>
+      <w:r>
+        <w:t>modèle qui peut être utilisé pour satisfaire mes besoins nutritionnels quotidiens à moindre coût</w:t>
+      </w:r>
+    </w:p>
+    <w:p>
+      <w:pPr>
+        <w:tabs>
+          <w:tab w:val="left" w:pos="2076"/>
+        </w:tabs>
+      </w:pPr>
+    </w:p>
+    <w:p>
+      <w:pPr>
+        <w:pStyle w:val="Titre1"/>
+      </w:pPr>
+      <w:r>
+        <w:t xml:space="preserve">Solution : </w:t>
+      </w:r>
+    </w:p>
+    <w:p>
+      <w:pPr>
+        <w:tabs>
+          <w:tab w:val="left" w:pos="2076"/>
+        </w:tabs>
+      </w:pPr>
+      <w:r>
+        <w:t xml:space="preserve">Comme toujours, nous commençons par déterminer les décisions qui doivent être prises par </w:t>
+      </w:r>
+      <w:r>
+        <w:t xml:space="preserve">celui qui </w:t>
+      </w:r>
+      <w:proofErr w:type="gramStart"/>
+      <w:r>
+        <w:t>décide</w:t>
+      </w:r>
+      <w:r>
+        <w:t>:</w:t>
+      </w:r>
+      <w:proofErr w:type="gramEnd"/>
+      <w:r>
+        <w:t xml:space="preserve"> quelle quantité de chaque type d'aliment doit être consommée quotidiennement. Ainsi, nous définissons les variables de décision</w:t>
+      </w:r>
+      <w:r>
+        <w:t> :</w:t>
+      </w:r>
+    </w:p>
+    <w:p>
+      <w:pPr>
+        <w:pStyle w:val="PrformatHTML"/>
+        <w:rPr>
+          <w:rStyle w:val="y2iqfc"/>
+        </w:rPr>
+      </w:pPr>
+      <w:proofErr w:type="gramStart"/>
+      <w:r>
+        <w:rPr>
+          <w:rStyle w:val="y2iqfc"/>
+        </w:rPr>
+        <w:t>x</w:t>
+      </w:r>
+      <w:proofErr w:type="gramEnd"/>
+      <w:r>
+        <w:rPr>
+          <w:rStyle w:val="y2iqfc"/>
+        </w:rPr>
+        <w:t>1 nombre de brownies consommés quotidiennement</w:t>
+      </w:r>
+    </w:p>
+    <w:p>
+      <w:pPr>
+        <w:pStyle w:val="PrformatHTML"/>
+        <w:rPr>
+          <w:rStyle w:val="y2iqfc"/>
+        </w:rPr>
+      </w:pPr>
+      <w:proofErr w:type="gramStart"/>
+      <w:r>
+        <w:rPr>
+          <w:rStyle w:val="y2iqfc"/>
+        </w:rPr>
+        <w:t>x</w:t>
+      </w:r>
+      <w:proofErr w:type="gramEnd"/>
+      <w:r>
+        <w:rPr>
+          <w:rStyle w:val="y2iqfc"/>
+        </w:rPr>
+        <w:t>2 nombre de boules de glace au chocolat consommées quotidiennement</w:t>
+      </w:r>
+    </w:p>
+    <w:p>
+      <w:pPr>
+        <w:pStyle w:val="PrformatHTML"/>
+        <w:rPr>
+          <w:rStyle w:val="y2iqfc"/>
+        </w:rPr>
+      </w:pPr>
+      <w:proofErr w:type="gramStart"/>
+      <w:r>
+        <w:rPr>
+          <w:rStyle w:val="y2iqfc"/>
+        </w:rPr>
+        <w:t>x</w:t>
+      </w:r>
+      <w:proofErr w:type="gramEnd"/>
+      <w:r>
+        <w:rPr>
+          <w:rStyle w:val="y2iqfc"/>
+        </w:rPr>
+        <w:t>3 bouteilles de cola bues quotidiennement</w:t>
+      </w:r>
+    </w:p>
+    <w:p>
+      <w:pPr>
+        <w:pStyle w:val="PrformatHTML"/>
+      </w:pPr>
+      <w:proofErr w:type="gramStart"/>
+      <w:r>
+        <w:rPr>
+          <w:rStyle w:val="y2iqfc"/>
+        </w:rPr>
+        <w:t>x</w:t>
+      </w:r>
+      <w:proofErr w:type="gramEnd"/>
+      <w:r>
+        <w:rPr>
+          <w:rStyle w:val="y2iqfc"/>
+        </w:rPr>
+        <w:t>4 morceaux de cheesecake à l'ananas consommés quotidiennement</w:t>
+      </w:r>
+    </w:p>
+    <w:p>
+      <w:pPr>
+        <w:tabs>
+          <w:tab w:val="left" w:pos="2076"/>
+        </w:tabs>
+      </w:pPr>
+    </w:p>
+    <w:p>
+      <w:pPr>
+        <w:tabs>
+          <w:tab w:val="left" w:pos="2076"/>
+        </w:tabs>
+      </w:pPr>
+      <w:r>
+        <w:t xml:space="preserve">L'objectif est de minimiser le coût de mon alimentation. </w:t>
+      </w:r>
+    </w:p>
+    <w:p>
+      <w:pPr>
+        <w:tabs>
+          <w:tab w:val="left" w:pos="2076"/>
+          <w:tab w:val="left" w:pos="8328"/>
+        </w:tabs>
+      </w:pPr>
+      <w:r>
+        <w:t xml:space="preserve">Le coût total de tout régime peut être déterminé à partir de la relation </w:t>
+      </w:r>
+      <w:proofErr w:type="gramStart"/>
+      <w:r>
+        <w:t>suivante:</w:t>
+      </w:r>
+      <w:proofErr w:type="gramEnd"/>
+      <w:r>
+        <w:tab/>
+      </w:r>
+    </w:p>
+    <w:p>
+      <w:pPr>
+        <w:tabs>
+          <w:tab w:val="left" w:pos="2076"/>
+        </w:tabs>
+      </w:pPr>
+      <w:r>
+        <w:t xml:space="preserve"> (</w:t>
+      </w:r>
+      <w:proofErr w:type="gramStart"/>
+      <w:r>
+        <w:t>coût</w:t>
+      </w:r>
+      <w:proofErr w:type="gramEnd"/>
+      <w:r>
+        <w:t xml:space="preserve"> total du régime) </w:t>
+      </w:r>
+      <w:r>
+        <w:t xml:space="preserve">= </w:t>
+      </w:r>
+      <w:r>
+        <w:t>(coût des brownies)</w:t>
+      </w:r>
+      <w:r>
+        <w:t>+</w:t>
+      </w:r>
+      <w:r>
+        <w:t xml:space="preserve"> (coût de la </w:t>
+      </w:r>
+      <w:proofErr w:type="spellStart"/>
+      <w:r>
+        <w:t>glacecrème</w:t>
+      </w:r>
+      <w:proofErr w:type="spellEnd"/>
+      <w:r>
+        <w:t xml:space="preserve">) </w:t>
+      </w:r>
+      <w:r>
+        <w:t>+</w:t>
+      </w:r>
+      <w:r>
+        <w:t xml:space="preserve">(coût du cola) </w:t>
+      </w:r>
+      <w:r>
+        <w:t>+</w:t>
+      </w:r>
+      <w:r>
+        <w:t xml:space="preserve"> </w:t>
+      </w:r>
+      <w:r>
+        <w:t>(coût du gâteau au fromage).</w:t>
+      </w:r>
+    </w:p>
+    <w:p>
+      <w:pPr>
+        <w:tabs>
+          <w:tab w:val="left" w:pos="2076"/>
+        </w:tabs>
+      </w:pPr>
+    </w:p>
+    <w:p>
+      <w:pPr>
+        <w:tabs>
+          <w:tab w:val="left" w:pos="2076"/>
+        </w:tabs>
+      </w:pPr>
+      <w:r>
+        <w:t xml:space="preserve">Autrement dit </w:t>
+      </w:r>
+    </w:p>
+    <w:p>
+      <w:pPr>
+        <w:tabs>
+          <w:tab w:val="left" w:pos="2076"/>
+        </w:tabs>
+      </w:pPr>
+      <w:r>
+        <w:t xml:space="preserve">Cout du régime = </w:t>
+      </w:r>
+      <w:r>
+        <w:t>50x1 + 20x2 + 30x3 + 80x4</w:t>
+      </w:r>
+    </w:p>
+    <w:p>
+      <w:pPr>
+        <w:tabs>
+          <w:tab w:val="left" w:pos="2076"/>
+        </w:tabs>
+      </w:pPr>
+      <w:r>
+        <w:t xml:space="preserve">Du coup, </w:t>
+      </w:r>
+      <w:proofErr w:type="gramStart"/>
+      <w:r>
+        <w:t>notre fonction objectif</w:t>
+      </w:r>
+      <w:proofErr w:type="gramEnd"/>
+      <w:r>
+        <w:t xml:space="preserve"> est :</w:t>
+      </w:r>
+    </w:p>
+    <w:p>
+      <w:pPr>
+        <w:tabs>
+          <w:tab w:val="left" w:pos="2076"/>
+        </w:tabs>
+      </w:pPr>
+      <w:proofErr w:type="gramStart"/>
+      <w:r>
+        <w:t>M</w:t>
+      </w:r>
+      <w:r>
+        <w:t>in</w:t>
+      </w:r>
+      <w:r>
+        <w:t>(</w:t>
+      </w:r>
+      <w:r>
+        <w:t xml:space="preserve"> z</w:t>
+      </w:r>
+      <w:proofErr w:type="gramEnd"/>
+      <w:r>
+        <w:t xml:space="preserve"> </w:t>
+      </w:r>
+      <w:r>
+        <w:t>)</w:t>
+      </w:r>
+      <w:r>
+        <w:t>=</w:t>
+      </w:r>
+      <w:r>
+        <w:t xml:space="preserve"> 50x1 </w:t>
+      </w:r>
+      <w:r>
+        <w:t>+</w:t>
+      </w:r>
+      <w:r>
+        <w:t xml:space="preserve"> 20x2 </w:t>
+      </w:r>
+      <w:r>
+        <w:t>+</w:t>
+      </w:r>
+      <w:r>
+        <w:t xml:space="preserve"> 30x3 </w:t>
+      </w:r>
+      <w:r>
+        <w:t>+</w:t>
+      </w:r>
+      <w:r>
+        <w:t xml:space="preserve"> 80x4</w:t>
+      </w:r>
+    </w:p>
+    <w:p>
+      <w:pPr>
+        <w:tabs>
+          <w:tab w:val="left" w:pos="2076"/>
+        </w:tabs>
+        <w:rPr>
+          <w:rStyle w:val="jlqj4b"/>
+        </w:rPr>
+      </w:pPr>
+      <w:r>
+        <w:rPr>
+          <w:rStyle w:val="jlqj4b"/>
+        </w:rPr>
+        <w:t xml:space="preserve">Les variables de décision doivent satisfaire les quatre contraintes </w:t>
+      </w:r>
+      <w:proofErr w:type="gramStart"/>
+      <w:r>
+        <w:rPr>
+          <w:rStyle w:val="jlqj4b"/>
+        </w:rPr>
+        <w:t>suivantes:</w:t>
+      </w:r>
+      <w:proofErr w:type="gramEnd"/>
+      <w:r>
+        <w:rPr>
+          <w:rStyle w:val="jlqj4b"/>
+        </w:rPr>
+        <w:t xml:space="preserve"> </w:t>
+      </w:r>
+    </w:p>
+    <w:p>
+      <w:pPr>
+        <w:tabs>
+          <w:tab w:val="left" w:pos="2076"/>
+        </w:tabs>
+        <w:rPr>
+          <w:rStyle w:val="jlqj4b"/>
+        </w:rPr>
+      </w:pPr>
+      <w:r>
+        <w:rPr>
+          <w:rStyle w:val="jlqj4b"/>
+        </w:rPr>
+        <w:t xml:space="preserve">Contrainte 1 L'apport calorique quotidien doit être d'au moins 500 calories. </w:t>
+      </w:r>
+    </w:p>
+    <w:p>
+      <w:pPr>
+        <w:tabs>
+          <w:tab w:val="left" w:pos="2076"/>
+        </w:tabs>
+        <w:rPr>
+          <w:rStyle w:val="jlqj4b"/>
+        </w:rPr>
+      </w:pPr>
+      <w:r>
+        <w:rPr>
+          <w:rStyle w:val="jlqj4b"/>
+        </w:rPr>
+        <w:t xml:space="preserve">Contrainte 2 La consommation quotidienne de chocolat doit être d'au moins 6 onces. </w:t>
+      </w:r>
+    </w:p>
+    <w:p>
+      <w:pPr>
+        <w:tabs>
+          <w:tab w:val="left" w:pos="2076"/>
+        </w:tabs>
+        <w:rPr>
+          <w:rStyle w:val="jlqj4b"/>
+        </w:rPr>
+      </w:pPr>
+      <w:r>
+        <w:rPr>
+          <w:rStyle w:val="jlqj4b"/>
+        </w:rPr>
+        <w:t xml:space="preserve">Contrainte 3 La consommation quotidienne de sucre doit être d'au moins 10 onces. </w:t>
+      </w:r>
+    </w:p>
+    <w:p>
+      <w:pPr>
+        <w:tabs>
+          <w:tab w:val="left" w:pos="2076"/>
+        </w:tabs>
+      </w:pPr>
+      <w:r>
+        <w:rPr>
+          <w:rStyle w:val="jlqj4b"/>
+        </w:rPr>
+        <w:t>Contrainte 4 L'apport quotidien en matières grasses doit être d'au moins 8 oz</w:t>
+      </w:r>
+    </w:p>
+    <w:p>
+      <w:pPr>
+        <w:tabs>
+          <w:tab w:val="left" w:pos="2076"/>
+        </w:tabs>
+      </w:pPr>
+    </w:p>
+    <w:p>
+      <w:pPr>
+        <w:tabs>
+          <w:tab w:val="left" w:pos="2076"/>
+        </w:tabs>
+        <w:rPr>
+          <w:b/>
+          <w:bCs/>
+        </w:rPr>
+      </w:pPr>
+      <w:r>
+        <w:rPr>
+          <w:b/>
+          <w:bCs/>
+        </w:rPr>
+        <w:t xml:space="preserve">TABLE 2 </w:t>
+      </w:r>
+    </w:p>
+    <w:p>
+      <w:pPr>
+        <w:tabs>
+          <w:tab w:val="left" w:pos="2076"/>
+        </w:tabs>
+      </w:pPr>
+      <w:r>
+        <w:t xml:space="preserve">Valeurs </w:t>
+      </w:r>
+      <w:proofErr w:type="spellStart"/>
+      <w:r>
+        <w:t>nutritionelles</w:t>
+      </w:r>
+      <w:proofErr w:type="spellEnd"/>
+      <w:r>
+        <w:t xml:space="preserve"> pour le </w:t>
+      </w:r>
+      <w:proofErr w:type="gramStart"/>
+      <w:r>
+        <w:t>régime .</w:t>
+      </w:r>
+      <w:proofErr w:type="gramEnd"/>
+    </w:p>
+    <w:p>
+      <w:pPr>
+        <w:pBdr>
+          <w:top w:val="single" w:sz="4" w:space="1" w:color="auto"/>
+          <w:left w:val="single" w:sz="4" w:space="4" w:color="auto"/>
+          <w:bottom w:val="single" w:sz="4" w:space="1" w:color="auto"/>
+          <w:right w:val="single" w:sz="4" w:space="4" w:color="auto"/>
+          <w:between w:val="single" w:sz="4" w:space="1" w:color="auto"/>
+          <w:bar w:val="single" w:sz="4" w:color="auto"/>
+        </w:pBdr>
+        <w:tabs>
+          <w:tab w:val="left" w:pos="2076"/>
+        </w:tabs>
+        <w:rPr>
+          <w:b/>
+          <w:bCs/>
+        </w:rPr>
+      </w:pPr>
+      <w:r>
+        <w:rPr>
+          <w:b/>
+          <w:bCs/>
+        </w:rPr>
+        <w:t xml:space="preserve">Type of Food </w:t>
+      </w:r>
+      <w:r>
+        <w:rPr>
+          <w:b/>
+          <w:bCs/>
+        </w:rPr>
+        <w:tab/>
+      </w:r>
+      <w:r>
+        <w:rPr>
+          <w:b/>
+          <w:bCs/>
+        </w:rPr>
+        <w:tab/>
+      </w:r>
+      <w:r>
+        <w:rPr>
+          <w:b/>
+          <w:bCs/>
+        </w:rPr>
+        <w:tab/>
+      </w:r>
+      <w:r>
+        <w:rPr>
+          <w:b/>
+          <w:bCs/>
+        </w:rPr>
+        <w:t xml:space="preserve">Calories </w:t>
+      </w:r>
+      <w:r>
+        <w:rPr>
+          <w:b/>
+          <w:bCs/>
+        </w:rPr>
+        <w:tab/>
+      </w:r>
+      <w:r>
+        <w:rPr>
+          <w:b/>
+          <w:bCs/>
+        </w:rPr>
+        <w:tab/>
+      </w:r>
+      <w:proofErr w:type="spellStart"/>
+      <w:r>
+        <w:rPr>
+          <w:b/>
+          <w:bCs/>
+        </w:rPr>
+        <w:t>Chocolate</w:t>
+      </w:r>
+      <w:proofErr w:type="spellEnd"/>
+      <w:r>
+        <w:rPr>
+          <w:b/>
+          <w:bCs/>
+        </w:rPr>
+        <w:t xml:space="preserve"> (</w:t>
+      </w:r>
+      <w:proofErr w:type="spellStart"/>
+      <w:r>
+        <w:rPr>
+          <w:b/>
+          <w:bCs/>
+        </w:rPr>
+        <w:t>Ounces</w:t>
+      </w:r>
+      <w:proofErr w:type="spellEnd"/>
+      <w:r>
+        <w:rPr>
+          <w:b/>
+          <w:bCs/>
+        </w:rPr>
+        <w:t xml:space="preserve">) </w:t>
+      </w:r>
+      <w:r>
+        <w:rPr>
+          <w:b/>
+          <w:bCs/>
+        </w:rPr>
+        <w:tab/>
+      </w:r>
+      <w:r>
+        <w:rPr>
+          <w:b/>
+          <w:bCs/>
+        </w:rPr>
+        <w:tab/>
+      </w:r>
+      <w:r>
+        <w:rPr>
+          <w:b/>
+          <w:bCs/>
+        </w:rPr>
+        <w:t>Sugar (</w:t>
+      </w:r>
+      <w:proofErr w:type="spellStart"/>
+      <w:r>
+        <w:rPr>
+          <w:b/>
+          <w:bCs/>
+        </w:rPr>
+        <w:t>Ounces</w:t>
+      </w:r>
+      <w:proofErr w:type="spellEnd"/>
+      <w:r>
+        <w:rPr>
+          <w:b/>
+          <w:bCs/>
+        </w:rPr>
+        <w:t>) Fat (</w:t>
+      </w:r>
+      <w:proofErr w:type="spellStart"/>
+      <w:r>
+        <w:rPr>
+          <w:b/>
+          <w:bCs/>
+        </w:rPr>
+        <w:t>Ounces</w:t>
+      </w:r>
+      <w:proofErr w:type="spellEnd"/>
+      <w:r>
+        <w:rPr>
+          <w:b/>
+          <w:bCs/>
+        </w:rPr>
+        <w:t>)</w:t>
+      </w:r>
+    </w:p>
+    <w:p>
+      <w:pPr>
+        <w:pBdr>
+          <w:top w:val="single" w:sz="4" w:space="1" w:color="auto"/>
+          <w:left w:val="single" w:sz="4" w:space="4" w:color="auto"/>
+          <w:bottom w:val="single" w:sz="4" w:space="1" w:color="auto"/>
+          <w:right w:val="single" w:sz="4" w:space="4" w:color="auto"/>
+          <w:between w:val="single" w:sz="4" w:space="1" w:color="auto"/>
+          <w:bar w:val="single" w:sz="4" w:color="auto"/>
+        </w:pBdr>
+        <w:tabs>
+          <w:tab w:val="left" w:pos="2076"/>
+        </w:tabs>
+      </w:pPr>
+      <w:r>
+        <w:t xml:space="preserve">Brownie </w:t>
+      </w:r>
+      <w:r>
+        <w:tab/>
+      </w:r>
+      <w:r>
+        <w:tab/>
+      </w:r>
+      <w:r>
+        <w:tab/>
+      </w:r>
+      <w:r>
+        <w:t xml:space="preserve">400 </w:t>
+      </w:r>
+      <w:r>
+        <w:tab/>
+      </w:r>
+      <w:r>
+        <w:tab/>
+      </w:r>
+      <w:r>
+        <w:tab/>
+      </w:r>
+      <w:r>
+        <w:t xml:space="preserve">3 </w:t>
+      </w:r>
+      <w:r>
+        <w:tab/>
+      </w:r>
+      <w:r>
+        <w:tab/>
+      </w:r>
+      <w:r>
+        <w:tab/>
+      </w:r>
+      <w:r>
+        <w:tab/>
+      </w:r>
+      <w:r>
+        <w:t xml:space="preserve">2 </w:t>
+      </w:r>
+      <w:r>
+        <w:tab/>
+      </w:r>
+      <w:r>
+        <w:tab/>
+      </w:r>
+      <w:r>
+        <w:t>2</w:t>
+      </w:r>
+    </w:p>
+    <w:p>
+      <w:pPr>
+        <w:pBdr>
+          <w:top w:val="single" w:sz="4" w:space="1" w:color="auto"/>
+          <w:left w:val="single" w:sz="4" w:space="4" w:color="auto"/>
+          <w:bottom w:val="single" w:sz="4" w:space="1" w:color="auto"/>
+          <w:right w:val="single" w:sz="4" w:space="4" w:color="auto"/>
+          <w:between w:val="single" w:sz="4" w:space="1" w:color="auto"/>
+          <w:bar w:val="single" w:sz="4" w:color="auto"/>
+        </w:pBdr>
+        <w:tabs>
+          <w:tab w:val="left" w:pos="2076"/>
+        </w:tabs>
+      </w:pPr>
+      <w:proofErr w:type="spellStart"/>
+      <w:r>
+        <w:t>Chocolate</w:t>
+      </w:r>
+      <w:proofErr w:type="spellEnd"/>
+      <w:r>
+        <w:t xml:space="preserve"> </w:t>
+      </w:r>
+      <w:proofErr w:type="spellStart"/>
+      <w:r>
+        <w:t>ice</w:t>
+      </w:r>
+      <w:proofErr w:type="spellEnd"/>
+      <w:r>
+        <w:t xml:space="preserve"> </w:t>
+      </w:r>
+      <w:proofErr w:type="spellStart"/>
+      <w:r>
+        <w:t>cream</w:t>
+      </w:r>
+      <w:proofErr w:type="spellEnd"/>
+      <w:r>
+        <w:t xml:space="preserve"> (1 scoop) </w:t>
+      </w:r>
+      <w:r>
+        <w:tab/>
+      </w:r>
+      <w:r>
+        <w:t xml:space="preserve">200 </w:t>
+      </w:r>
+      <w:r>
+        <w:tab/>
+      </w:r>
+      <w:r>
+        <w:tab/>
+      </w:r>
+      <w:r>
+        <w:tab/>
+      </w:r>
+      <w:r>
+        <w:t xml:space="preserve">2 </w:t>
+      </w:r>
+      <w:r>
+        <w:tab/>
+      </w:r>
+      <w:r>
+        <w:tab/>
+      </w:r>
+      <w:r>
+        <w:tab/>
+      </w:r>
+      <w:r>
+        <w:tab/>
+      </w:r>
+      <w:r>
+        <w:t xml:space="preserve">2 </w:t>
+      </w:r>
+      <w:r>
+        <w:tab/>
+      </w:r>
+      <w:r>
+        <w:tab/>
+      </w:r>
+      <w:r>
+        <w:t xml:space="preserve">4 </w:t>
+      </w:r>
+    </w:p>
+    <w:p>
+      <w:pPr>
+        <w:pBdr>
+          <w:top w:val="single" w:sz="4" w:space="1" w:color="auto"/>
+          <w:left w:val="single" w:sz="4" w:space="4" w:color="auto"/>
+          <w:bottom w:val="single" w:sz="4" w:space="1" w:color="auto"/>
+          <w:right w:val="single" w:sz="4" w:space="4" w:color="auto"/>
+          <w:between w:val="single" w:sz="4" w:space="1" w:color="auto"/>
+          <w:bar w:val="single" w:sz="4" w:color="auto"/>
+        </w:pBdr>
+        <w:tabs>
+          <w:tab w:val="left" w:pos="2076"/>
+        </w:tabs>
+      </w:pPr>
+      <w:r>
+        <w:t xml:space="preserve">Cola (1 </w:t>
+      </w:r>
+      <w:proofErr w:type="spellStart"/>
+      <w:r>
+        <w:t>bottle</w:t>
+      </w:r>
+      <w:proofErr w:type="spellEnd"/>
+      <w:r>
+        <w:t xml:space="preserve">) </w:t>
+      </w:r>
+      <w:r>
+        <w:tab/>
+      </w:r>
+      <w:r>
+        <w:tab/>
+      </w:r>
+      <w:r>
+        <w:tab/>
+      </w:r>
+      <w:r>
+        <w:t xml:space="preserve">150 </w:t>
+      </w:r>
+      <w:r>
+        <w:tab/>
+      </w:r>
+      <w:r>
+        <w:tab/>
+      </w:r>
+      <w:r>
+        <w:tab/>
+      </w:r>
+      <w:r>
+        <w:t xml:space="preserve">0 </w:t>
+      </w:r>
+      <w:r>
+        <w:tab/>
+      </w:r>
+      <w:r>
+        <w:tab/>
+      </w:r>
+      <w:r>
+        <w:tab/>
+      </w:r>
+      <w:r>
+        <w:tab/>
+      </w:r>
+      <w:r>
+        <w:t xml:space="preserve">4 </w:t>
+      </w:r>
+      <w:r>
+        <w:tab/>
+      </w:r>
+      <w:r>
+        <w:tab/>
+      </w:r>
+      <w:r>
+        <w:t xml:space="preserve">1 </w:t>
+      </w:r>
+    </w:p>
+    <w:p>
+      <w:pPr>
+        <w:pBdr>
+          <w:top w:val="single" w:sz="4" w:space="1" w:color="auto"/>
+          <w:left w:val="single" w:sz="4" w:space="4" w:color="auto"/>
+          <w:bottom w:val="single" w:sz="4" w:space="1" w:color="auto"/>
+          <w:right w:val="single" w:sz="4" w:space="4" w:color="auto"/>
+          <w:between w:val="single" w:sz="4" w:space="1" w:color="auto"/>
+          <w:bar w:val="single" w:sz="4" w:color="auto"/>
+        </w:pBdr>
+        <w:tabs>
+          <w:tab w:val="left" w:pos="2076"/>
+        </w:tabs>
+      </w:pPr>
+      <w:proofErr w:type="spellStart"/>
+      <w:r>
+        <w:t>Pineapple</w:t>
+      </w:r>
+      <w:proofErr w:type="spellEnd"/>
+      <w:r>
+        <w:t xml:space="preserve"> cheesecake</w:t>
+      </w:r>
+      <w:r>
+        <w:t xml:space="preserve"> (1piece)</w:t>
+      </w:r>
+      <w:r>
+        <w:tab/>
+        <w:t>500</w:t>
+      </w:r>
+      <w:r>
+        <w:tab/>
+      </w:r>
+      <w:r>
+        <w:tab/>
+      </w:r>
+      <w:r>
+        <w:tab/>
+        <w:t>0</w:t>
+      </w:r>
+      <w:r>
+        <w:tab/>
+      </w:r>
+      <w:r>
+        <w:tab/>
+      </w:r>
+      <w:r>
+        <w:tab/>
+      </w:r>
+      <w:r>
+        <w:tab/>
+        <w:t>4</w:t>
+      </w:r>
+      <w:r>
+        <w:tab/>
+      </w:r>
+      <w:r>
+        <w:tab/>
+        <w:t>5</w:t>
+      </w:r>
+    </w:p>
+    <w:p>
+      <w:pPr>
+        <w:tabs>
+          <w:tab w:val="left" w:pos="2076"/>
+        </w:tabs>
+      </w:pPr>
+    </w:p>
+    <w:p>
+      <w:pPr>
+        <w:tabs>
+          <w:tab w:val="left" w:pos="2076"/>
+        </w:tabs>
+      </w:pPr>
+      <w:r>
+        <w:t>La contrainte 1 s’exprime de la sorte :</w:t>
+      </w:r>
+    </w:p>
+    <w:p>
+      <w:pPr>
+        <w:tabs>
+          <w:tab w:val="left" w:pos="2076"/>
+        </w:tabs>
+      </w:pPr>
+      <w:r>
+        <w:t xml:space="preserve">400x1 </w:t>
+      </w:r>
+      <w:r>
+        <w:t>+</w:t>
+      </w:r>
+      <w:r>
+        <w:t xml:space="preserve"> 200x2 </w:t>
+      </w:r>
+      <w:r>
+        <w:t>+</w:t>
+      </w:r>
+      <w:r>
+        <w:t xml:space="preserve"> 150x3 </w:t>
+      </w:r>
+      <w:r>
+        <w:t xml:space="preserve">+ </w:t>
+      </w:r>
+      <w:r>
+        <w:t xml:space="preserve">500x4 </w:t>
+      </w:r>
+      <w:r>
+        <w:t>&lt;=</w:t>
+      </w:r>
+      <w:r>
+        <w:t xml:space="preserve"> 500 (Calorie </w:t>
+      </w:r>
+      <w:proofErr w:type="spellStart"/>
+      <w:r>
+        <w:t>constraint</w:t>
+      </w:r>
+      <w:proofErr w:type="spellEnd"/>
+      <w:r>
+        <w:t>)</w:t>
+      </w:r>
+    </w:p>
+    <w:p>
+      <w:pPr>
+        <w:tabs>
+          <w:tab w:val="left" w:pos="2076"/>
+        </w:tabs>
+      </w:pPr>
+    </w:p>
+    <w:p>
+      <w:pPr>
+        <w:tabs>
+          <w:tab w:val="left" w:pos="2076"/>
+        </w:tabs>
+      </w:pPr>
+      <w:r>
+        <w:lastRenderedPageBreak/>
+        <w:t xml:space="preserve">La contrainte </w:t>
+      </w:r>
+      <w:r>
+        <w:t>2</w:t>
+      </w:r>
+      <w:r>
+        <w:t xml:space="preserve"> s’exprime de la sorte :</w:t>
+      </w:r>
+    </w:p>
+    <w:p>
+      <w:pPr>
+        <w:tabs>
+          <w:tab w:val="left" w:pos="2076"/>
+        </w:tabs>
+      </w:pPr>
+      <w:r>
+        <w:t xml:space="preserve">3x1 </w:t>
+      </w:r>
+      <w:r>
+        <w:t>+</w:t>
+      </w:r>
+      <w:r>
+        <w:t xml:space="preserve"> 2x2 </w:t>
+      </w:r>
+      <w:r>
+        <w:t xml:space="preserve">&gt;= </w:t>
+      </w:r>
+      <w:r>
+        <w:t>6 (</w:t>
+      </w:r>
+      <w:proofErr w:type="spellStart"/>
+      <w:r>
+        <w:t>Chocolate</w:t>
+      </w:r>
+      <w:proofErr w:type="spellEnd"/>
+      <w:r>
+        <w:t xml:space="preserve"> </w:t>
+      </w:r>
+      <w:proofErr w:type="spellStart"/>
+      <w:r>
+        <w:t>constraint</w:t>
+      </w:r>
+      <w:proofErr w:type="spellEnd"/>
+      <w:r>
+        <w:t xml:space="preserve">) </w:t>
+      </w:r>
+    </w:p>
+    <w:p>
+      <w:pPr>
+        <w:tabs>
+          <w:tab w:val="left" w:pos="2076"/>
+        </w:tabs>
+      </w:pPr>
+      <w:r>
+        <w:t xml:space="preserve">La contrainte </w:t>
+      </w:r>
+      <w:r>
+        <w:t>3</w:t>
+      </w:r>
+      <w:r>
+        <w:t xml:space="preserve"> s’exprime de la sorte :</w:t>
+      </w:r>
+    </w:p>
+    <w:p>
+      <w:pPr>
+        <w:tabs>
+          <w:tab w:val="left" w:pos="2076"/>
+        </w:tabs>
+      </w:pPr>
+      <w:r>
+        <w:t>2x1</w:t>
+      </w:r>
+      <w:r>
+        <w:t xml:space="preserve"> +</w:t>
+      </w:r>
+      <w:r>
+        <w:t xml:space="preserve"> 2x2 </w:t>
+      </w:r>
+      <w:r>
+        <w:t>+</w:t>
+      </w:r>
+      <w:r>
+        <w:t xml:space="preserve"> 4x3 </w:t>
+      </w:r>
+      <w:r>
+        <w:t>+</w:t>
+      </w:r>
+      <w:r>
+        <w:t>4x4 &gt;=10 (Su</w:t>
+      </w:r>
+      <w:r>
+        <w:t>cre</w:t>
+      </w:r>
+      <w:r>
+        <w:t xml:space="preserve"> </w:t>
+      </w:r>
+      <w:proofErr w:type="spellStart"/>
+      <w:r>
+        <w:t>constraint</w:t>
+      </w:r>
+      <w:proofErr w:type="spellEnd"/>
+      <w:r>
+        <w:t xml:space="preserve">) </w:t>
+      </w:r>
+    </w:p>
+    <w:p>
+      <w:pPr>
+        <w:tabs>
+          <w:tab w:val="left" w:pos="2076"/>
+        </w:tabs>
+      </w:pPr>
+      <w:r>
+        <w:t xml:space="preserve">La contrainte </w:t>
+      </w:r>
+      <w:r>
+        <w:t>4</w:t>
+      </w:r>
+      <w:r>
+        <w:t xml:space="preserve"> s’exprime de la sorte :</w:t>
+      </w:r>
+    </w:p>
+    <w:p>
+      <w:pPr>
+        <w:tabs>
+          <w:tab w:val="left" w:pos="2076"/>
+        </w:tabs>
+      </w:pPr>
+      <w:r>
+        <w:t>2x1</w:t>
+      </w:r>
+      <w:r>
+        <w:t xml:space="preserve"> +</w:t>
+      </w:r>
+      <w:r>
+        <w:t xml:space="preserve"> 4x2 </w:t>
+      </w:r>
+      <w:r>
+        <w:t>+</w:t>
+      </w:r>
+      <w:r>
+        <w:t>x3</w:t>
+      </w:r>
+      <w:r>
+        <w:t>+</w:t>
+      </w:r>
+      <w:r>
+        <w:t xml:space="preserve"> 5x4 &gt;</w:t>
+      </w:r>
+      <w:proofErr w:type="gramStart"/>
+      <w:r>
+        <w:t>=  8</w:t>
+      </w:r>
+      <w:proofErr w:type="gramEnd"/>
+      <w:r>
+        <w:t xml:space="preserve"> (</w:t>
+      </w:r>
+      <w:r>
+        <w:t>Gras</w:t>
+      </w:r>
+      <w:r>
+        <w:t xml:space="preserve"> </w:t>
+      </w:r>
+      <w:proofErr w:type="spellStart"/>
+      <w:r>
+        <w:t>constraint</w:t>
+      </w:r>
+      <w:proofErr w:type="spellEnd"/>
+      <w:r>
+        <w:t>)</w:t>
+      </w:r>
+    </w:p>
+    <w:p>
+      <w:pPr>
+        <w:tabs>
+          <w:tab w:val="left" w:pos="2076"/>
+        </w:tabs>
+      </w:pPr>
+      <w:r>
+        <w:t>Et enfin la restriction de signe</w:t>
+      </w:r>
+      <w:r>
+        <w:t xml:space="preserve"> xi &gt;= 0 (i </w:t>
+      </w:r>
+      <w:r>
+        <w:t>=</w:t>
+      </w:r>
+      <w:r>
+        <w:t xml:space="preserve"> 1, 2, 3, 4) </w:t>
+      </w:r>
+      <w:r>
+        <w:t>doit s’appliquer.</w:t>
+      </w:r>
+    </w:p>
+    <w:p>
+      <w:pPr>
+        <w:tabs>
+          <w:tab w:val="left" w:pos="2076"/>
+        </w:tabs>
+      </w:pPr>
+      <w:r>
+        <w:t xml:space="preserve">La </w:t>
+      </w:r>
+      <w:r>
+        <w:t xml:space="preserve">Combinaison </w:t>
+      </w:r>
+      <w:proofErr w:type="gramStart"/>
+      <w:r>
+        <w:t>de la fonction objectif</w:t>
+      </w:r>
+      <w:proofErr w:type="gramEnd"/>
+      <w:r>
+        <w:t>, des contraintes et des restrictions de signe</w:t>
+      </w:r>
+    </w:p>
+    <w:p>
+      <w:pPr>
+        <w:tabs>
+          <w:tab w:val="left" w:pos="2076"/>
+        </w:tabs>
+      </w:pPr>
+      <w:proofErr w:type="gramStart"/>
+      <w:r>
+        <w:t>donne</w:t>
+      </w:r>
+      <w:proofErr w:type="gramEnd"/>
+      <w:r>
+        <w:t xml:space="preserve"> </w:t>
+      </w:r>
+      <w:r>
+        <w:t xml:space="preserve">Le programme linéaire </w:t>
+      </w:r>
+      <w:r>
+        <w:t xml:space="preserve"> qui suit:</w:t>
+      </w:r>
+    </w:p>
+    <w:p>
+      <w:pPr>
+        <w:tabs>
+          <w:tab w:val="left" w:pos="2076"/>
+        </w:tabs>
+      </w:pPr>
+      <w:r>
+        <w:rPr>
+          <w:noProof/>
+        </w:rPr>
+        <w:drawing>
+          <wp:inline distT="0" distB="0" distL="0" distR="0" wp14:anchorId="5FE9349D" wp14:editId="4A8F33A0">
+            <wp:extent cx="6840220" cy="1582420"/>
+            <wp:effectExtent l="0" t="0" r="0" b="0"/>
+            <wp:docPr id="2" name="Image 2"/>
+            <wp:cNvGraphicFramePr>
+              <a:graphicFrameLocks xmlns:a="http://schemas.openxmlformats.org/drawingml/2006/main" noChangeAspect="1"/>
+            </wp:cNvGraphicFramePr>
+            <a:graphic xmlns:a="http://schemas.openxmlformats.org/drawingml/2006/main">
+              <a:graphicData uri="http://schemas.openxmlformats.org/drawingml/2006/picture">
+                <pic:pic xmlns:pic="http://schemas.openxmlformats.org/drawingml/2006/picture">
+                  <pic:nvPicPr>
+                    <pic:cNvPr id="1" name=""/>
+                    <pic:cNvPicPr/>
+                  </pic:nvPicPr>
+                  <pic:blipFill>
+                    <a:blip r:embed="rId7"/>
+                    <a:stretch>
+                      <a:fillRect/>
+                    </a:stretch>
+                  </pic:blipFill>
+                  <pic:spPr>
+                    <a:xfrm>
+                      <a:off x="0" y="0"/>
+                      <a:ext cx="6840220" cy="1582420"/>
+                    </a:xfrm>
+                    <a:prstGeom prst="rect">
+                      <a:avLst/>
+                    </a:prstGeom>
+                  </pic:spPr>
+                </pic:pic>
+              </a:graphicData>
+            </a:graphic>
+          </wp:inline>
+        </w:drawing>
+      </w:r>
+    </w:p>
+    <w:p>
+      <w:pPr>
+        <w:tabs>
+          <w:tab w:val="left" w:pos="2076"/>
+        </w:tabs>
+      </w:pPr>
+    </w:p>
+    <w:p>
+      <w:pPr>
+        <w:tabs>
+          <w:tab w:val="left" w:pos="2076"/>
+        </w:tabs>
+      </w:pPr>
+    </w:p>
+    <w:p>
+      <w:pPr>
+        <w:tabs>
+          <w:tab w:val="left" w:pos="2076"/>
+        </w:tabs>
+      </w:pPr>
+      <w:r>
+        <w:t>La solution optimale pour ce LP est x1</w:t>
+      </w:r>
+      <w:r>
+        <w:t xml:space="preserve"> =</w:t>
+      </w:r>
+      <w:r>
+        <w:t xml:space="preserve"> x4</w:t>
+      </w:r>
+      <w:r>
+        <w:t xml:space="preserve"> =</w:t>
+      </w:r>
+      <w:r>
+        <w:t xml:space="preserve"> 0, x2 </w:t>
+      </w:r>
+      <w:r>
+        <w:t xml:space="preserve">= </w:t>
+      </w:r>
+      <w:r>
+        <w:t xml:space="preserve">3, x3 </w:t>
+      </w:r>
+      <w:r>
+        <w:t xml:space="preserve">= </w:t>
+      </w:r>
+      <w:r>
+        <w:t xml:space="preserve">1, z </w:t>
+      </w:r>
+      <w:r>
+        <w:t xml:space="preserve">= </w:t>
+      </w:r>
+      <w:r>
+        <w:t xml:space="preserve">90. </w:t>
+      </w:r>
+    </w:p>
+    <w:p>
+      <w:pPr>
+        <w:tabs>
+          <w:tab w:val="left" w:pos="2076"/>
+        </w:tabs>
+      </w:pPr>
+      <w:r>
+        <w:t xml:space="preserve">Ainsi, le régime à prix minimum entraîne un coût quotidien de 90 ¢ en mangeant trois boules de glace au chocolat et en buvant une bouteille de cola. </w:t>
+      </w:r>
+    </w:p>
+    <w:p>
+      <w:pPr>
+        <w:tabs>
+          <w:tab w:val="left" w:pos="2076"/>
+        </w:tabs>
+      </w:pPr>
+      <w:r>
+        <w:t xml:space="preserve">La valeur z optimale peut être obtenue en substituant la valeur optimale des variables de décision dans </w:t>
+      </w:r>
+      <w:proofErr w:type="gramStart"/>
+      <w:r>
+        <w:t>la fonction objectif</w:t>
+      </w:r>
+      <w:proofErr w:type="gramEnd"/>
+      <w:r>
+        <w:t>.</w:t>
+      </w:r>
+    </w:p>
+    <w:p>
+      <w:pPr>
+        <w:tabs>
+          <w:tab w:val="left" w:pos="2076"/>
+        </w:tabs>
+      </w:pPr>
+      <w:r>
+        <w:t xml:space="preserve"> Cela donne un coût total de </w:t>
+      </w:r>
+      <w:proofErr w:type="gramStart"/>
+      <w:r>
+        <w:t>z</w:t>
+      </w:r>
+      <w:r>
+        <w:t xml:space="preserve"> </w:t>
+      </w:r>
+      <w:r>
+        <w:t xml:space="preserve"> 3</w:t>
+      </w:r>
+      <w:proofErr w:type="gramEnd"/>
+      <w:r>
+        <w:t xml:space="preserve"> (20) 1 (30) 90 ¢. </w:t>
+      </w:r>
+    </w:p>
+    <w:p>
+      <w:pPr>
+        <w:tabs>
+          <w:tab w:val="left" w:pos="2076"/>
+        </w:tabs>
+      </w:pPr>
+      <w:r>
+        <w:rPr>
+          <w:noProof/>
+        </w:rPr>
+        <w:drawing>
+          <wp:inline distT="0" distB="0" distL="0" distR="0" wp14:anchorId="6C1579A1" wp14:editId="0EE7FCAB">
+            <wp:extent cx="3962400" cy="1495425"/>
+            <wp:effectExtent l="0" t="0" r="0" b="9525"/>
+            <wp:docPr id="3" name="Image 3"/>
+            <wp:cNvGraphicFramePr>
+              <a:graphicFrameLocks xmlns:a="http://schemas.openxmlformats.org/drawingml/2006/main" noChangeAspect="1"/>
+            </wp:cNvGraphicFramePr>
+            <a:graphic xmlns:a="http://schemas.openxmlformats.org/drawingml/2006/main">
+              <a:graphicData uri="http://schemas.openxmlformats.org/drawingml/2006/picture">
+                <pic:pic xmlns:pic="http://schemas.openxmlformats.org/drawingml/2006/picture">
+                  <pic:nvPicPr>
+                    <pic:cNvPr id="1" name=""/>
+                    <pic:cNvPicPr/>
+                  </pic:nvPicPr>
+                  <pic:blipFill>
+                    <a:blip r:embed="rId8"/>
+                    <a:stretch>
+                      <a:fillRect/>
+                    </a:stretch>
+                  </pic:blipFill>
+                  <pic:spPr>
+                    <a:xfrm>
+                      <a:off x="0" y="0"/>
+                      <a:ext cx="3962400" cy="1495425"/>
+                    </a:xfrm>
+                    <a:prstGeom prst="rect">
+                      <a:avLst/>
+                    </a:prstGeom>
+                  </pic:spPr>
+                </pic:pic>
+              </a:graphicData>
+            </a:graphic>
+          </wp:inline>
+        </w:drawing>
+      </w:r>
+    </w:p>
+    <w:p>
+      <w:pPr>
+        <w:tabs>
+          <w:tab w:val="left" w:pos="2076"/>
+        </w:tabs>
+      </w:pPr>
+      <w:proofErr w:type="gramStart"/>
+      <w:r>
+        <w:t>les</w:t>
+      </w:r>
+      <w:proofErr w:type="gramEnd"/>
+      <w:r>
+        <w:t xml:space="preserve"> contraintes de chocolat et de sucre sont contraignantes, mais les contraintes de calories et de matières grasses ne sont pas contraignantes.</w:t>
+      </w:r>
+    </w:p>
+    <w:p>
+      <w:pPr>
+        <w:tabs>
+          <w:tab w:val="left" w:pos="2076"/>
+        </w:tabs>
+      </w:pPr>
+      <w:r>
+        <w:t xml:space="preserve">Une version du problème de l'alimentation avec une liste plus réaliste des aliments et des besoins nutritionnels a été l'un des premiers LP à être résolu par ordinateur. </w:t>
+      </w:r>
+    </w:p>
+    <w:p>
+      <w:pPr>
+        <w:tabs>
+          <w:tab w:val="left" w:pos="2076"/>
+        </w:tabs>
+      </w:pPr>
+      <w:r>
+        <w:t xml:space="preserve">Stigler (1945) a proposé </w:t>
+      </w:r>
+      <w:proofErr w:type="gramStart"/>
+      <w:r>
+        <w:t>un</w:t>
+      </w:r>
+      <w:r>
+        <w:t xml:space="preserve">  </w:t>
+      </w:r>
+      <w:r>
+        <w:t>problème</w:t>
+      </w:r>
+      <w:proofErr w:type="gramEnd"/>
+      <w:r>
+        <w:t xml:space="preserve"> de régime</w:t>
+      </w:r>
+      <w:r>
+        <w:t xml:space="preserve"> dans lequel 77 types d'aliments étaient disponibles et 10 besoins nutritionnels (vitamine</w:t>
+      </w:r>
+      <w:r>
+        <w:t xml:space="preserve"> </w:t>
+      </w:r>
+      <w:r>
+        <w:t xml:space="preserve">A, vitamine C, etc.) devaient être satisfaites. </w:t>
+      </w:r>
+    </w:p>
+    <w:p>
+      <w:pPr>
+        <w:tabs>
+          <w:tab w:val="left" w:pos="2076"/>
+        </w:tabs>
+      </w:pPr>
+      <w:r>
+        <w:t>Une fois résolue par ordinateur, la solution optimale a donné un régime composé de semoule de maïs, farine de blé, lait évaporé, beurre d'arachide, saindoux,</w:t>
+      </w:r>
+      <w:r>
+        <w:t xml:space="preserve"> </w:t>
+      </w:r>
+      <w:proofErr w:type="spellStart"/>
+      <w:r>
+        <w:t>boeuf</w:t>
+      </w:r>
+      <w:proofErr w:type="spellEnd"/>
+      <w:r>
+        <w:t xml:space="preserve">, foie, pommes de terre, épinards et chou. </w:t>
+      </w:r>
+    </w:p>
+    <w:p>
+      <w:pPr>
+        <w:tabs>
+          <w:tab w:val="left" w:pos="2076"/>
+        </w:tabs>
+      </w:pPr>
+      <w:r>
+        <w:lastRenderedPageBreak/>
+        <w:t>Bien qu'un tel régime soit clairement riche en nutriments vitaux, peu de gens en seraient satisfaits car il ne semble pas répondre à un minimum</w:t>
+      </w:r>
+      <w:r>
+        <w:t xml:space="preserve"> </w:t>
+      </w:r>
+      <w:r>
+        <w:t xml:space="preserve">niveau goût (et Stigler exigeait que le même régime soit consommé chaque jour). </w:t>
+      </w:r>
+    </w:p>
+    <w:p>
+      <w:pPr>
+        <w:tabs>
+          <w:tab w:val="left" w:pos="2076"/>
+        </w:tabs>
+      </w:pPr>
+      <w:r>
+        <w:t>La solution optimale à tout modèle LP ne reflétera que les aspects de la réalité capturés par</w:t>
+      </w:r>
+      <w:r>
+        <w:t xml:space="preserve"> </w:t>
+      </w:r>
+      <w:r>
+        <w:t xml:space="preserve">la fonction objective et les contraintes. </w:t>
+      </w:r>
+    </w:p>
+    <w:p>
+      <w:pPr>
+        <w:tabs>
+          <w:tab w:val="left" w:pos="2076"/>
+        </w:tabs>
+      </w:pPr>
+      <w:r>
+        <w:t>La formulation de Stigler du problème alimentaire</w:t>
+      </w:r>
+      <w:r>
+        <w:t xml:space="preserve"> </w:t>
+      </w:r>
+      <w:r>
+        <w:t xml:space="preserve">ne reflétait pas le désir des gens d’avoir une alimentation savoureuse et variée. </w:t>
+      </w:r>
+    </w:p>
+    <w:p>
+      <w:pPr>
+        <w:tabs>
+          <w:tab w:val="left" w:pos="2076"/>
+        </w:tabs>
+      </w:pPr>
+      <w:r>
+        <w:t>La programmation en nombres entiers a été utilisée</w:t>
+      </w:r>
+      <w:r>
+        <w:t xml:space="preserve"> </w:t>
+      </w:r>
+      <w:r>
+        <w:t xml:space="preserve">pour planifier des menus institutionnels pour une période hebdomadaire ou mensuelle. </w:t>
+      </w:r>
+    </w:p>
+    <w:p>
+      <w:pPr>
+        <w:tabs>
+          <w:tab w:val="left" w:pos="2076"/>
+        </w:tabs>
+      </w:pPr>
+      <w:r>
+        <w:t>Les modèles de planification de menus contiennent des contraintes qui reflètent les exigences de goût et de variété</w:t>
+      </w:r>
+      <w:r>
+        <w:t>.</w:t>
+      </w:r>
+    </w:p>
+    <w:p>
+      <w:pPr>
+        <w:tabs>
+          <w:tab w:val="left" w:pos="2076"/>
+        </w:tabs>
+      </w:pPr>
+    </w:p>
+    <w:p>
+      <w:pPr>
+        <w:pStyle w:val="Titre2"/>
+      </w:pPr>
+      <w:r>
+        <w:t>Problèmes</w:t>
+      </w:r>
+    </w:p>
+    <w:p>
+      <w:pPr>
+        <w:tabs>
+          <w:tab w:val="left" w:pos="2076"/>
+        </w:tabs>
+      </w:pPr>
+    </w:p>
+    <w:p>
+      <w:pPr>
+        <w:pStyle w:val="Titre2"/>
+        <w:rPr>
+          <w:rStyle w:val="jlqj4b"/>
+        </w:rPr>
+      </w:pPr>
+      <w:r>
+        <w:rPr>
+          <w:rStyle w:val="jlqj4b"/>
+        </w:rPr>
+        <w:t>1</w:t>
+      </w:r>
+    </w:p>
+    <w:p>
+      <w:pPr>
+        <w:tabs>
+          <w:tab w:val="left" w:pos="2076"/>
+        </w:tabs>
+        <w:rPr>
+          <w:rStyle w:val="jlqj4b"/>
+        </w:rPr>
+      </w:pPr>
+      <w:r>
+        <w:rPr>
+          <w:rStyle w:val="jlqj4b"/>
+        </w:rPr>
+        <w:t xml:space="preserve">Il y a trois usines sur la rivière </w:t>
+      </w:r>
+      <w:proofErr w:type="spellStart"/>
+      <w:r>
+        <w:rPr>
+          <w:rStyle w:val="jlqj4b"/>
+        </w:rPr>
+        <w:t>Momiss</w:t>
+      </w:r>
+      <w:proofErr w:type="spellEnd"/>
+      <w:r>
+        <w:rPr>
+          <w:rStyle w:val="jlqj4b"/>
+        </w:rPr>
+        <w:t xml:space="preserve"> (1, 2 et 3). </w:t>
+      </w:r>
+    </w:p>
+    <w:p>
+      <w:pPr>
+        <w:tabs>
+          <w:tab w:val="left" w:pos="2076"/>
+        </w:tabs>
+        <w:rPr>
+          <w:rStyle w:val="jlqj4b"/>
+        </w:rPr>
+      </w:pPr>
+      <w:r>
+        <w:rPr>
+          <w:rStyle w:val="jlqj4b"/>
+        </w:rPr>
+        <w:t xml:space="preserve">Chacun émet deux types de polluants (1 et 2) dans le fleuve. </w:t>
+      </w:r>
+    </w:p>
+    <w:p>
+      <w:pPr>
+        <w:tabs>
+          <w:tab w:val="left" w:pos="2076"/>
+        </w:tabs>
+        <w:rPr>
+          <w:rStyle w:val="jlqj4b"/>
+        </w:rPr>
+      </w:pPr>
+      <w:r>
+        <w:rPr>
+          <w:rStyle w:val="jlqj4b"/>
+        </w:rPr>
+        <w:t>Si les déchets de chaque usine sont traités, la pollution dans la rivière peut être réduite.</w:t>
+      </w:r>
+    </w:p>
+    <w:p>
+      <w:pPr>
+        <w:tabs>
+          <w:tab w:val="left" w:pos="2076"/>
+        </w:tabs>
+        <w:rPr>
+          <w:rStyle w:val="jlqj4b"/>
+        </w:rPr>
+      </w:pPr>
+      <w:r>
+        <w:rPr>
+          <w:rStyle w:val="jlqj4b"/>
+        </w:rPr>
+        <w:t xml:space="preserve"> Il en coûte 15 $ pour traiter une tonne de déchets d'usine 1, et chaque tonne traitée réduit la quantité de polluant 1 de 0,10 tonne et la quantité de polluant 2 de 0,45 tonne. </w:t>
+      </w:r>
+    </w:p>
+    <w:p>
+      <w:pPr>
+        <w:tabs>
+          <w:tab w:val="left" w:pos="2076"/>
+        </w:tabs>
+        <w:rPr>
+          <w:rStyle w:val="jlqj4b"/>
+        </w:rPr>
+      </w:pPr>
+      <w:r>
+        <w:rPr>
+          <w:rStyle w:val="jlqj4b"/>
+        </w:rPr>
+        <w:t xml:space="preserve">Il en coûte 10 $ pour traiter une tonne de déchets d'usine 2, et chaque tonne traitée réduira la quantité de polluant 1 de 0,20 tonne et la quantité de polluant 2 de 0,25 tonne. </w:t>
+      </w:r>
+    </w:p>
+    <w:p>
+      <w:pPr>
+        <w:tabs>
+          <w:tab w:val="left" w:pos="2076"/>
+        </w:tabs>
+        <w:rPr>
+          <w:rStyle w:val="jlqj4b"/>
+        </w:rPr>
+      </w:pPr>
+      <w:r>
+        <w:rPr>
+          <w:rStyle w:val="jlqj4b"/>
+        </w:rPr>
+        <w:t xml:space="preserve">Il en coûte 20 $ pour traiter une tonne de déchets d'usine 3, et chaque tonne traitée réduira la quantité de polluant 1 de 0,40 tonne et la quantité de polluant 2 de 0,30 tonne. </w:t>
+      </w:r>
+    </w:p>
+    <w:p>
+      <w:pPr>
+        <w:tabs>
+          <w:tab w:val="left" w:pos="2076"/>
+        </w:tabs>
+        <w:rPr>
+          <w:rStyle w:val="jlqj4b"/>
+        </w:rPr>
+      </w:pPr>
+      <w:r>
+        <w:rPr>
+          <w:rStyle w:val="jlqj4b"/>
+        </w:rPr>
+        <w:t xml:space="preserve">L'Etat souhaite réduire la quantité de polluant 1 dans la rivière d'au moins 30 tonnes et la quantité de polluant 2 dans la rivière d'au moins 40 tonnes. </w:t>
+      </w:r>
+    </w:p>
+    <w:p>
+      <w:pPr>
+        <w:tabs>
+          <w:tab w:val="left" w:pos="2076"/>
+        </w:tabs>
+        <w:rPr>
+          <w:rStyle w:val="jlqj4b"/>
+        </w:rPr>
+      </w:pPr>
+      <w:r>
+        <w:rPr>
+          <w:rStyle w:val="jlqj4b"/>
+        </w:rPr>
+        <w:t xml:space="preserve">Formulez une LP qui minimisera le coût de la réduction de la pollution des quantités souhaitées. Pensez-vous que les hypothèses LP (proportionnalité, additivité, divisibilité et certitude) sont raisonnables pour ce </w:t>
+      </w:r>
+      <w:proofErr w:type="gramStart"/>
+      <w:r>
+        <w:rPr>
+          <w:rStyle w:val="jlqj4b"/>
+        </w:rPr>
+        <w:t>problème?</w:t>
+      </w:r>
+      <w:proofErr w:type="gramEnd"/>
+    </w:p>
+    <w:p>
+      <w:pPr>
+        <w:tabs>
+          <w:tab w:val="left" w:pos="2076"/>
+        </w:tabs>
+        <w:rPr>
+          <w:rStyle w:val="jlqj4b"/>
+        </w:rPr>
+      </w:pPr>
+    </w:p>
+    <w:p>
+      <w:pPr>
+        <w:pStyle w:val="Titre2"/>
+        <w:rPr>
+          <w:rStyle w:val="jlqj4b"/>
+        </w:rPr>
+      </w:pPr>
+      <w:r>
+        <w:rPr>
+          <w:rStyle w:val="jlqj4b"/>
+        </w:rPr>
+        <w:t>2</w:t>
+      </w:r>
+    </w:p>
+    <w:p>
+      <w:pPr>
+        <w:rPr>
+          <w:rStyle w:val="viiyi"/>
+        </w:rPr>
+      </w:pPr>
+      <w:r>
+        <w:rPr>
+          <w:rStyle w:val="jlqj4b"/>
+        </w:rPr>
+        <w:t xml:space="preserve">U.S. </w:t>
+      </w:r>
+      <w:proofErr w:type="spellStart"/>
+      <w:r>
+        <w:rPr>
+          <w:rStyle w:val="jlqj4b"/>
+        </w:rPr>
+        <w:t>Labs</w:t>
+      </w:r>
+      <w:proofErr w:type="spellEnd"/>
+      <w:r>
+        <w:rPr>
+          <w:rStyle w:val="jlqj4b"/>
+        </w:rPr>
+        <w:t xml:space="preserve"> fabrique des valves cardiaques mécaniques à partir des valves cardiaques de porcs.</w:t>
+      </w:r>
+      <w:r>
+        <w:rPr>
+          <w:rStyle w:val="viiyi"/>
+        </w:rPr>
+        <w:t xml:space="preserve"> </w:t>
+      </w:r>
+    </w:p>
+    <w:p>
+      <w:pPr>
+        <w:rPr>
+          <w:rStyle w:val="viiyi"/>
+        </w:rPr>
+      </w:pPr>
+      <w:r>
+        <w:rPr>
+          <w:rStyle w:val="jlqj4b"/>
+        </w:rPr>
+        <w:t>Différentes opérations cardiaques nécessitent des vannes de différentes tailles.</w:t>
+      </w:r>
+      <w:r>
+        <w:rPr>
+          <w:rStyle w:val="viiyi"/>
+        </w:rPr>
+        <w:t xml:space="preserve"> </w:t>
+      </w:r>
+    </w:p>
+    <w:p>
+      <w:pPr>
+        <w:rPr>
+          <w:rStyle w:val="viiyi"/>
+        </w:rPr>
+      </w:pPr>
+      <w:r>
+        <w:rPr>
+          <w:rStyle w:val="jlqj4b"/>
+        </w:rPr>
+        <w:t xml:space="preserve">U.S. </w:t>
+      </w:r>
+      <w:proofErr w:type="spellStart"/>
+      <w:r>
+        <w:rPr>
+          <w:rStyle w:val="jlqj4b"/>
+        </w:rPr>
+        <w:t>Labs</w:t>
+      </w:r>
+      <w:proofErr w:type="spellEnd"/>
+      <w:r>
+        <w:rPr>
+          <w:rStyle w:val="jlqj4b"/>
+        </w:rPr>
+        <w:t xml:space="preserve"> achète des vannes de porc auprès de trois fournisseurs différents.</w:t>
+      </w:r>
+      <w:r>
+        <w:rPr>
+          <w:rStyle w:val="viiyi"/>
+        </w:rPr>
+        <w:t xml:space="preserve"> </w:t>
+      </w:r>
+    </w:p>
+    <w:p>
+      <w:pPr>
+        <w:rPr>
+          <w:rStyle w:val="jlqj4b"/>
+        </w:rPr>
+      </w:pPr>
+      <w:r>
+        <w:rPr>
+          <w:rStyle w:val="jlqj4b"/>
+        </w:rPr>
+        <w:t xml:space="preserve">Le coût et la taille des vannes achetées auprès de chaque fournisseur sont indiqués dans le tableau </w:t>
+      </w:r>
+      <w:proofErr w:type="gramStart"/>
+      <w:r>
+        <w:rPr>
+          <w:rStyle w:val="jlqj4b"/>
+        </w:rPr>
+        <w:t>3:</w:t>
+      </w:r>
+      <w:proofErr w:type="gramEnd"/>
+      <w:r>
+        <w:rPr>
+          <w:rStyle w:val="jlqj4b"/>
+        </w:rPr>
+        <w:t xml:space="preserve"> </w:t>
+      </w:r>
+    </w:p>
+    <w:p>
+      <w:pPr>
+        <w:rPr>
+          <w:rStyle w:val="jlqj4b"/>
+        </w:rPr>
+      </w:pPr>
+      <w:r>
+        <w:rPr>
+          <w:noProof/>
+        </w:rPr>
+        <w:drawing>
+          <wp:inline distT="0" distB="0" distL="0" distR="0" wp14:anchorId="0805B7B6" wp14:editId="5E6572F1">
+            <wp:extent cx="4667250" cy="1924050"/>
+            <wp:effectExtent l="0" t="0" r="0" b="0"/>
+            <wp:docPr id="4" name="Image 4"/>
+            <wp:cNvGraphicFramePr>
+              <a:graphicFrameLocks xmlns:a="http://schemas.openxmlformats.org/drawingml/2006/main" noChangeAspect="1"/>
+            </wp:cNvGraphicFramePr>
+            <a:graphic xmlns:a="http://schemas.openxmlformats.org/drawingml/2006/main">
+              <a:graphicData uri="http://schemas.openxmlformats.org/drawingml/2006/picture">
+                <pic:pic xmlns:pic="http://schemas.openxmlformats.org/drawingml/2006/picture">
+                  <pic:nvPicPr>
+                    <pic:cNvPr id="1" name=""/>
+                    <pic:cNvPicPr/>
+                  </pic:nvPicPr>
+                  <pic:blipFill>
+                    <a:blip r:embed="rId9"/>
+                    <a:stretch>
+                      <a:fillRect/>
+                    </a:stretch>
+                  </pic:blipFill>
+                  <pic:spPr>
+                    <a:xfrm>
+                      <a:off x="0" y="0"/>
+                      <a:ext cx="4667250" cy="1924050"/>
+                    </a:xfrm>
+                    <a:prstGeom prst="rect">
+                      <a:avLst/>
+                    </a:prstGeom>
+                  </pic:spPr>
+                </pic:pic>
+              </a:graphicData>
+            </a:graphic>
+          </wp:inline>
+        </w:drawing>
+      </w:r>
+    </w:p>
+    <w:p>
+      <w:pPr>
+        <w:rPr>
+          <w:rStyle w:val="jlqj4b"/>
+        </w:rPr>
+      </w:pPr>
+      <w:r>
+        <w:rPr>
+          <w:rStyle w:val="jlqj4b"/>
+        </w:rPr>
+        <w:lastRenderedPageBreak/>
+        <w:t xml:space="preserve">Chaque mois, U.S. </w:t>
+      </w:r>
+      <w:proofErr w:type="spellStart"/>
+      <w:r>
+        <w:rPr>
+          <w:rStyle w:val="jlqj4b"/>
+        </w:rPr>
+        <w:t>Labs</w:t>
+      </w:r>
+      <w:proofErr w:type="spellEnd"/>
+      <w:r>
+        <w:rPr>
+          <w:rStyle w:val="jlqj4b"/>
+        </w:rPr>
+        <w:t xml:space="preserve"> passe une commande auprès de chaque fournisseur.</w:t>
+      </w:r>
+    </w:p>
+    <w:p>
+      <w:pPr>
+        <w:rPr>
+          <w:rStyle w:val="viiyi"/>
+        </w:rPr>
+      </w:pPr>
+      <w:r>
+        <w:rPr>
+          <w:rStyle w:val="jlqj4b"/>
+        </w:rPr>
+        <w:t>Au moins 500 vannes grandes, 300 moyennes et 300 petites doivent être achetées chaque mois.</w:t>
+      </w:r>
+      <w:r>
+        <w:rPr>
+          <w:rStyle w:val="viiyi"/>
+        </w:rPr>
+        <w:t xml:space="preserve"> </w:t>
+      </w:r>
+    </w:p>
+    <w:p>
+      <w:pPr>
+        <w:rPr>
+          <w:rStyle w:val="viiyi"/>
+        </w:rPr>
+      </w:pPr>
+      <w:r>
+        <w:rPr>
+          <w:rStyle w:val="jlqj4b"/>
+        </w:rPr>
+        <w:t>En raison de la disponibilité limitée des vannes de raccordement, au plus 700 vannes par mois peuvent être achetées auprès de chaque fournisseur.</w:t>
+      </w:r>
+      <w:r>
+        <w:rPr>
+          <w:rStyle w:val="viiyi"/>
+        </w:rPr>
+        <w:t xml:space="preserve"> </w:t>
+      </w:r>
+    </w:p>
+    <w:p>
+      <w:pPr>
+        <w:rPr>
+          <w:rStyle w:val="jlqj4b"/>
+        </w:rPr>
+      </w:pPr>
+      <w:r>
+        <w:rPr>
+          <w:rStyle w:val="jlqj4b"/>
+        </w:rPr>
+        <w:t>Formulez un LP qui peut être utilisé pour minimiser le coût d'acquisition des vannes nécessaires.</w:t>
+      </w:r>
+    </w:p>
+    <w:p>
+      <w:pPr>
+        <w:rPr>
+          <w:rStyle w:val="jlqj4b"/>
+        </w:rPr>
+      </w:pPr>
+    </w:p>
+    <w:p>
+      <w:pPr>
+        <w:pStyle w:val="Titre1"/>
+        <w:rPr>
+          <w:rStyle w:val="jlqj4b"/>
+        </w:rPr>
+      </w:pPr>
+      <w:r>
+        <w:rPr>
+          <w:rStyle w:val="jlqj4b"/>
+        </w:rPr>
+        <w:t>3</w:t>
+      </w:r>
+    </w:p>
+    <w:p>
+      <w:pPr>
+        <w:rPr>
+          <w:rStyle w:val="viiyi"/>
+        </w:rPr>
+      </w:pPr>
+      <w:proofErr w:type="spellStart"/>
+      <w:r>
+        <w:rPr>
+          <w:rStyle w:val="jlqj4b"/>
+        </w:rPr>
+        <w:t>Peg</w:t>
+      </w:r>
+      <w:proofErr w:type="spellEnd"/>
+      <w:r>
+        <w:rPr>
+          <w:rStyle w:val="jlqj4b"/>
+        </w:rPr>
+        <w:t xml:space="preserve"> et Al Fundy ont un budget alimentaire limité, donc </w:t>
+      </w:r>
+      <w:proofErr w:type="spellStart"/>
+      <w:r>
+        <w:rPr>
+          <w:rStyle w:val="jlqj4b"/>
+        </w:rPr>
+        <w:t>Peg</w:t>
+      </w:r>
+      <w:proofErr w:type="spellEnd"/>
+      <w:r>
+        <w:rPr>
+          <w:rStyle w:val="jlqj4b"/>
+        </w:rPr>
+        <w:t xml:space="preserve"> </w:t>
+      </w:r>
+      <w:proofErr w:type="spellStart"/>
+      <w:r>
+        <w:rPr>
+          <w:rStyle w:val="jlqj4b"/>
+        </w:rPr>
+        <w:t>istrying</w:t>
+      </w:r>
+      <w:proofErr w:type="spellEnd"/>
+      <w:r>
+        <w:rPr>
+          <w:rStyle w:val="jlqj4b"/>
+        </w:rPr>
+        <w:t xml:space="preserve"> doit nourrir la famille le moins cher possible.</w:t>
+      </w:r>
+      <w:r>
+        <w:rPr>
+          <w:rStyle w:val="viiyi"/>
+        </w:rPr>
+        <w:t xml:space="preserve"> </w:t>
+      </w:r>
+    </w:p>
+    <w:p>
+      <w:pPr>
+        <w:rPr>
+          <w:rStyle w:val="jlqj4b"/>
+        </w:rPr>
+      </w:pPr>
+      <w:r>
+        <w:rPr>
+          <w:rStyle w:val="jlqj4b"/>
+        </w:rPr>
+        <w:t>Cependant, elle veut toujours s'assurer que les membres de sa famille satisfont à leurs besoins nutritionnels quotidiens.</w:t>
+      </w:r>
+    </w:p>
+    <w:p>
+      <w:pPr>
+        <w:rPr>
+          <w:rStyle w:val="viiyi"/>
+        </w:rPr>
+      </w:pPr>
+      <w:r>
+        <w:rPr>
+          <w:rStyle w:val="viiyi"/>
+        </w:rPr>
+        <w:t xml:space="preserve"> </w:t>
+      </w:r>
+      <w:proofErr w:type="spellStart"/>
+      <w:r>
+        <w:rPr>
+          <w:rStyle w:val="jlqj4b"/>
+        </w:rPr>
+        <w:t>Peg</w:t>
+      </w:r>
+      <w:proofErr w:type="spellEnd"/>
+      <w:r>
+        <w:rPr>
+          <w:rStyle w:val="jlqj4b"/>
+        </w:rPr>
+        <w:t xml:space="preserve"> peut acheter deux aliments.</w:t>
+      </w:r>
+      <w:r>
+        <w:rPr>
+          <w:rStyle w:val="viiyi"/>
+        </w:rPr>
+        <w:t xml:space="preserve"> </w:t>
+      </w:r>
+    </w:p>
+    <w:p>
+      <w:pPr>
+        <w:rPr>
+          <w:rStyle w:val="viiyi"/>
+        </w:rPr>
+      </w:pPr>
+    </w:p>
+    <w:p>
+      <w:pPr>
+        <w:pStyle w:val="Paragraphedeliste"/>
+        <w:numPr>
+          <w:ilvl w:val="0"/>
+          <w:numId w:val="3"/>
+        </w:numPr>
+        <w:rPr>
+          <w:rStyle w:val="jlqj4b"/>
+        </w:rPr>
+      </w:pPr>
+      <w:r>
+        <w:rPr>
+          <w:rStyle w:val="jlqj4b"/>
+        </w:rPr>
+        <w:t xml:space="preserve">L’alimentation </w:t>
+      </w:r>
+      <w:r>
+        <w:rPr>
+          <w:rStyle w:val="jlqj4b"/>
+        </w:rPr>
+        <w:t>1 se vend 7 $ la livre, et chaque livre contient 3 unités de vitamine A et 1 unité de vitamine C.</w:t>
+      </w:r>
+    </w:p>
+    <w:p>
+      <w:pPr>
+        <w:pStyle w:val="Paragraphedeliste"/>
+        <w:numPr>
+          <w:ilvl w:val="0"/>
+          <w:numId w:val="3"/>
+        </w:numPr>
+        <w:rPr>
+          <w:rStyle w:val="jlqj4b"/>
+        </w:rPr>
+      </w:pPr>
+      <w:r>
+        <w:rPr>
+          <w:rStyle w:val="jlqj4b"/>
+        </w:rPr>
+        <w:t xml:space="preserve">L'alimentation 2 se vend 1 $ par livre, et chaque livre contient 1 unité de chaque vitamine </w:t>
+      </w:r>
+    </w:p>
+    <w:p>
+      <w:pPr>
+        <w:rPr>
+          <w:rStyle w:val="jlqj4b"/>
+        </w:rPr>
+      </w:pPr>
+      <w:r>
+        <w:rPr>
+          <w:rStyle w:val="jlqj4b"/>
+        </w:rPr>
+        <w:t>Chaque jour, la famille a besoin d'au moins 12 unités de</w:t>
+      </w:r>
+      <w:r>
+        <w:rPr>
+          <w:rStyle w:val="viiyi"/>
+        </w:rPr>
+        <w:t xml:space="preserve"> </w:t>
+      </w:r>
+      <w:r>
+        <w:rPr>
+          <w:rStyle w:val="jlqj4b"/>
+        </w:rPr>
+        <w:t>de vitamine A et 6 unités de vitamine C.</w:t>
+      </w:r>
+    </w:p>
+    <w:p>
+      <w:pPr>
+        <w:rPr>
+          <w:rStyle w:val="jlqj4b"/>
+        </w:rPr>
+      </w:pPr>
+    </w:p>
+    <w:p>
+      <w:pPr>
+        <w:rPr>
+          <w:rStyle w:val="jlqj4b"/>
+        </w:rPr>
+      </w:pPr>
+      <w:proofErr w:type="spellStart"/>
+      <w:proofErr w:type="gramStart"/>
+      <w:r>
+        <w:rPr>
+          <w:rStyle w:val="jlqj4b"/>
+        </w:rPr>
+        <w:t>a</w:t>
+      </w:r>
+      <w:r>
+        <w:rPr>
+          <w:rStyle w:val="jlqj4b"/>
+        </w:rPr>
+        <w:t>.</w:t>
+      </w:r>
+      <w:r>
+        <w:rPr>
+          <w:rStyle w:val="jlqj4b"/>
+        </w:rPr>
+        <w:t>Vérifiez</w:t>
+      </w:r>
+      <w:proofErr w:type="spellEnd"/>
+      <w:proofErr w:type="gramEnd"/>
+      <w:r>
+        <w:rPr>
+          <w:rStyle w:val="jlqj4b"/>
+        </w:rPr>
+        <w:t xml:space="preserve"> que </w:t>
+      </w:r>
+      <w:proofErr w:type="spellStart"/>
+      <w:r>
+        <w:rPr>
+          <w:rStyle w:val="jlqj4b"/>
+        </w:rPr>
+        <w:t>Peg</w:t>
+      </w:r>
+      <w:proofErr w:type="spellEnd"/>
+      <w:r>
+        <w:rPr>
+          <w:rStyle w:val="jlqj4b"/>
+        </w:rPr>
+        <w:t xml:space="preserve"> devrait acheter 12 unités de nourriture 2 par jour et ainsi sur-satisfaire les besoins en vitamine C de 6 unités.</w:t>
+      </w:r>
+    </w:p>
+    <w:p>
+      <w:pPr>
+        <w:rPr>
+          <w:rStyle w:val="jlqj4b"/>
+        </w:rPr>
+      </w:pPr>
+      <w:proofErr w:type="spellStart"/>
+      <w:proofErr w:type="gramStart"/>
+      <w:r>
+        <w:rPr>
+          <w:rStyle w:val="jlqj4b"/>
+        </w:rPr>
+        <w:t>b</w:t>
+      </w:r>
+      <w:r>
+        <w:rPr>
+          <w:rStyle w:val="jlqj4b"/>
+        </w:rPr>
+        <w:t>.</w:t>
+      </w:r>
+      <w:r>
+        <w:rPr>
+          <w:rStyle w:val="jlqj4b"/>
+        </w:rPr>
+        <w:t>Al</w:t>
+      </w:r>
+      <w:proofErr w:type="spellEnd"/>
+      <w:proofErr w:type="gramEnd"/>
+      <w:r>
+        <w:rPr>
+          <w:rStyle w:val="jlqj4b"/>
+        </w:rPr>
+        <w:t xml:space="preserve"> a mis le pied à terre et a exigé que </w:t>
+      </w:r>
+      <w:proofErr w:type="spellStart"/>
+      <w:r>
+        <w:rPr>
+          <w:rStyle w:val="jlqj4b"/>
+        </w:rPr>
+        <w:t>Peg</w:t>
+      </w:r>
+      <w:proofErr w:type="spellEnd"/>
+      <w:r>
+        <w:rPr>
+          <w:rStyle w:val="jlqj4b"/>
+        </w:rPr>
+        <w:t xml:space="preserve"> réponde exactement aux besoins nutritionnels quotidiens de la famille en obtenant précisément</w:t>
+      </w:r>
+      <w:r>
+        <w:rPr>
+          <w:rStyle w:val="viiyi"/>
+        </w:rPr>
+        <w:t xml:space="preserve"> </w:t>
+      </w:r>
+      <w:r>
+        <w:rPr>
+          <w:rStyle w:val="jlqj4b"/>
+        </w:rPr>
+        <w:t xml:space="preserve">12 unités de vitamine A et 6 unités de vitamine </w:t>
+      </w:r>
+    </w:p>
+    <w:p>
+      <w:r>
+        <w:rPr>
+          <w:rStyle w:val="jlqj4b"/>
+        </w:rPr>
+        <w:t>C. La solution optimale au nouveau problème consistera à ingérer moins de vitamine C, mais elle sera plus coûteuse.</w:t>
+      </w:r>
+      <w:r>
+        <w:rPr>
+          <w:rStyle w:val="viiyi"/>
+        </w:rPr>
+        <w:t xml:space="preserve"> </w:t>
+      </w:r>
+      <w:r>
+        <w:rPr>
+          <w:rStyle w:val="jlqj4b"/>
+        </w:rPr>
+        <w:t>Pourquoi</w:t>
+      </w:r>
+      <w:r>
+        <w:rPr>
+          <w:rStyle w:val="jlqj4b"/>
+        </w:rPr>
+        <w:t xml:space="preserve"> </w:t>
+      </w:r>
+      <w:r>
+        <w:rPr>
+          <w:rStyle w:val="jlqj4b"/>
+        </w:rPr>
+        <w:t>?</w:t>
+      </w:r>
+    </w:p>
+    <w:p>
+      <w:pPr>
+        <w:pStyle w:val="Titre2"/>
+        <w:rPr>
+          <w:rStyle w:val="jlqj4b"/>
+        </w:rPr>
+      </w:pPr>
+      <w:r>
+        <w:rPr>
+          <w:rStyle w:val="jlqj4b"/>
+        </w:rPr>
+        <w:t>4</w:t>
+      </w:r>
+    </w:p>
+    <w:p>
+      <w:pPr>
+        <w:tabs>
+          <w:tab w:val="left" w:pos="2076"/>
+        </w:tabs>
+        <w:rPr>
+          <w:rStyle w:val="viiyi"/>
+        </w:rPr>
+      </w:pPr>
+      <w:r>
+        <w:rPr>
+          <w:rStyle w:val="jlqj4b"/>
+        </w:rPr>
+        <w:t xml:space="preserve">Boucles </w:t>
+      </w:r>
+      <w:proofErr w:type="gramStart"/>
+      <w:r>
+        <w:rPr>
+          <w:rStyle w:val="jlqj4b"/>
+        </w:rPr>
+        <w:t xml:space="preserve">d’or </w:t>
+      </w:r>
+      <w:r>
+        <w:rPr>
+          <w:rStyle w:val="jlqj4b"/>
+        </w:rPr>
+        <w:t xml:space="preserve"> doit</w:t>
+      </w:r>
+      <w:proofErr w:type="gramEnd"/>
+      <w:r>
+        <w:rPr>
+          <w:rStyle w:val="jlqj4b"/>
+        </w:rPr>
+        <w:t xml:space="preserve"> trouver au moins 12 livres d'or et au moins 18 livres d'argent pour payer le loyer mensuel.</w:t>
+      </w:r>
+      <w:r>
+        <w:rPr>
+          <w:rStyle w:val="viiyi"/>
+        </w:rPr>
+        <w:t xml:space="preserve"> </w:t>
+      </w:r>
+    </w:p>
+    <w:p>
+      <w:pPr>
+        <w:tabs>
+          <w:tab w:val="left" w:pos="2076"/>
+        </w:tabs>
+        <w:rPr>
+          <w:rStyle w:val="viiyi"/>
+        </w:rPr>
+      </w:pPr>
+      <w:r>
+        <w:rPr>
+          <w:rStyle w:val="jlqj4b"/>
+        </w:rPr>
+        <w:t xml:space="preserve">Il y a deux </w:t>
+      </w:r>
+      <w:r>
+        <w:rPr>
+          <w:rStyle w:val="jlqj4b"/>
+        </w:rPr>
+        <w:t xml:space="preserve">mines </w:t>
+      </w:r>
+      <w:r>
+        <w:rPr>
+          <w:rStyle w:val="jlqj4b"/>
+        </w:rPr>
+        <w:t>dans lesquels Boucle d'or peut trouver de l'or et de l'argent.</w:t>
+      </w:r>
+      <w:r>
+        <w:rPr>
+          <w:rStyle w:val="viiyi"/>
+        </w:rPr>
+        <w:t xml:space="preserve"> </w:t>
+      </w:r>
+    </w:p>
+    <w:p>
+      <w:pPr>
+        <w:tabs>
+          <w:tab w:val="left" w:pos="2076"/>
+        </w:tabs>
+        <w:rPr>
+          <w:rStyle w:val="viiyi"/>
+        </w:rPr>
+      </w:pPr>
+      <w:r>
+        <w:rPr>
+          <w:rStyle w:val="jlqj4b"/>
+        </w:rPr>
+        <w:t xml:space="preserve">Chaque jour que Boucles d’or  </w:t>
+      </w:r>
+      <w:r>
+        <w:rPr>
+          <w:rStyle w:val="jlqj4b"/>
+        </w:rPr>
+        <w:t xml:space="preserve"> </w:t>
+      </w:r>
+      <w:r>
+        <w:rPr>
+          <w:rStyle w:val="jlqj4b"/>
+        </w:rPr>
+        <w:t xml:space="preserve">passe dans </w:t>
+      </w:r>
+      <w:r>
+        <w:rPr>
+          <w:rStyle w:val="jlqj4b"/>
+        </w:rPr>
+        <w:t>la mine</w:t>
+      </w:r>
+      <w:r>
+        <w:rPr>
+          <w:rStyle w:val="jlqj4b"/>
+        </w:rPr>
+        <w:t xml:space="preserve"> 1, elle trouve 2 livres d'or et 2 livres d'argent.</w:t>
+      </w:r>
+      <w:r>
+        <w:rPr>
+          <w:rStyle w:val="viiyi"/>
+        </w:rPr>
+        <w:t xml:space="preserve"> </w:t>
+      </w:r>
+    </w:p>
+    <w:p>
+      <w:pPr>
+        <w:tabs>
+          <w:tab w:val="left" w:pos="2076"/>
+        </w:tabs>
+        <w:rPr>
+          <w:rStyle w:val="viiyi"/>
+        </w:rPr>
+      </w:pPr>
+      <w:r>
+        <w:rPr>
+          <w:rStyle w:val="jlqj4b"/>
+        </w:rPr>
+        <w:t xml:space="preserve">Chaque jour que Boucles d’or  </w:t>
+      </w:r>
+      <w:r>
+        <w:rPr>
+          <w:rStyle w:val="jlqj4b"/>
+        </w:rPr>
+        <w:t xml:space="preserve"> </w:t>
+      </w:r>
+      <w:r>
+        <w:rPr>
+          <w:rStyle w:val="jlqj4b"/>
+        </w:rPr>
+        <w:t xml:space="preserve">passe dans </w:t>
+      </w:r>
+      <w:r>
+        <w:rPr>
+          <w:rStyle w:val="jlqj4b"/>
+        </w:rPr>
+        <w:t>la mine 2</w:t>
+      </w:r>
+      <w:r>
+        <w:rPr>
+          <w:rStyle w:val="jlqj4b"/>
+        </w:rPr>
+        <w:t>, elle trouve 1 livre d'or et 3 livres d'argent.</w:t>
+      </w:r>
+      <w:r>
+        <w:rPr>
+          <w:rStyle w:val="viiyi"/>
+        </w:rPr>
+        <w:t xml:space="preserve"> </w:t>
+      </w:r>
+    </w:p>
+    <w:p>
+      <w:pPr>
+        <w:tabs>
+          <w:tab w:val="left" w:pos="2076"/>
+        </w:tabs>
+        <w:rPr>
+          <w:rStyle w:val="viiyi"/>
+        </w:rPr>
+      </w:pPr>
+      <w:r>
+        <w:rPr>
+          <w:rStyle w:val="jlqj4b"/>
+        </w:rPr>
+        <w:t>Formulez un LP pour aider Boucle d'or à répondre à ses besoins tout en passant le moins de temps possible dans les mines.</w:t>
+      </w:r>
+      <w:r>
+        <w:rPr>
+          <w:rStyle w:val="viiyi"/>
+        </w:rPr>
+        <w:t xml:space="preserve"> </w:t>
+      </w:r>
+    </w:p>
+    <w:p>
+      <w:pPr>
+        <w:tabs>
+          <w:tab w:val="left" w:pos="2076"/>
+        </w:tabs>
+        <w:rPr>
+          <w:rStyle w:val="jlqj4b"/>
+        </w:rPr>
+      </w:pPr>
+      <w:r>
+        <w:rPr>
+          <w:rStyle w:val="jlqj4b"/>
+        </w:rPr>
+        <w:t>Résolvez graphiquement le LP.</w:t>
+      </w:r>
+    </w:p>
+    <w:p>
+      <w:pPr>
+        <w:pStyle w:val="Titre1"/>
+      </w:pPr>
+      <w:r>
+        <w:rPr>
+          <w:rStyle w:val="jlqj4b"/>
+        </w:rPr>
+        <w:t>3.5A Problème d'horaire de travail</w:t>
+      </w:r>
+      <w:r>
+        <w:t xml:space="preserve"> </w:t>
+      </w:r>
+    </w:p>
+    <w:p/>
+    <w:p>
+      <w:pPr>
+        <w:rPr>
+          <w:rStyle w:val="viiyi"/>
+        </w:rPr>
+      </w:pPr>
+      <w:r>
+        <w:rPr>
+          <w:rStyle w:val="jlqj4b"/>
+        </w:rPr>
+        <w:t>De nombreuses applications de la programmation linéaire impliquent de déterminer la méthode du coût minimum pour satisfaire les besoins en main-d'œuvre.</w:t>
+      </w:r>
+      <w:r>
+        <w:rPr>
+          <w:rStyle w:val="viiyi"/>
+        </w:rPr>
+        <w:t xml:space="preserve"> </w:t>
+      </w:r>
+    </w:p>
+    <w:p>
+      <w:pPr>
+        <w:rPr>
+          <w:rStyle w:val="jlqj4b"/>
+        </w:rPr>
+      </w:pPr>
+      <w:r>
+        <w:rPr>
+          <w:rStyle w:val="jlqj4b"/>
+        </w:rPr>
+        <w:t>L'exemple suivant illustre les fonctionnalités de base communes à bon nombre de ces applications.</w:t>
+      </w:r>
+    </w:p>
+    <w:p>
+      <w:pPr>
+        <w:rPr>
+          <w:rStyle w:val="jlqj4b"/>
+          <w:b/>
+          <w:bCs/>
+        </w:rPr>
+      </w:pPr>
+      <w:r>
+        <w:rPr>
+          <w:rStyle w:val="jlqj4b"/>
+          <w:b/>
+          <w:bCs/>
+        </w:rPr>
+        <w:t>Ex</w:t>
+      </w:r>
+      <w:r>
+        <w:rPr>
+          <w:rStyle w:val="jlqj4b"/>
+          <w:b/>
+          <w:bCs/>
+        </w:rPr>
+        <w:t>e</w:t>
+      </w:r>
+      <w:r>
+        <w:rPr>
+          <w:rStyle w:val="jlqj4b"/>
+          <w:b/>
+          <w:bCs/>
+        </w:rPr>
+        <w:t>mple 1 :</w:t>
+      </w:r>
+    </w:p>
+    <w:p>
+      <w:pPr>
+        <w:rPr>
+          <w:rStyle w:val="viiyi"/>
+        </w:rPr>
+      </w:pPr>
+      <w:r>
+        <w:rPr>
+          <w:rStyle w:val="jlqj4b"/>
+        </w:rPr>
+        <w:t>Un bureau de poste a besoin d'un nombre différent d'employés à temps plein à différents jours de la semaine.</w:t>
+      </w:r>
+      <w:r>
+        <w:rPr>
+          <w:rStyle w:val="viiyi"/>
+        </w:rPr>
+        <w:t xml:space="preserve"> </w:t>
+      </w:r>
+    </w:p>
+    <w:p>
+      <w:pPr>
+        <w:rPr>
+          <w:rStyle w:val="jlqj4b"/>
+        </w:rPr>
+      </w:pPr>
+      <w:r>
+        <w:rPr>
+          <w:rStyle w:val="jlqj4b"/>
+        </w:rPr>
+        <w:t xml:space="preserve">Le nombre d'employés à temps plein requis chaque jour est indiqué dans le tableau 4. </w:t>
+      </w:r>
+    </w:p>
+    <w:p>
+      <w:pPr>
+        <w:rPr>
+          <w:rStyle w:val="viiyi"/>
+        </w:rPr>
+      </w:pPr>
+      <w:r>
+        <w:rPr>
+          <w:rStyle w:val="jlqj4b"/>
+        </w:rPr>
+        <w:lastRenderedPageBreak/>
+        <w:t>Les règles syndicales stipulent que chaque employé à temps plein doit travailler cinq jours consécutifs, puis bénéficier de deux jours de congé.</w:t>
+      </w:r>
+      <w:r>
+        <w:rPr>
+          <w:rStyle w:val="viiyi"/>
+        </w:rPr>
+        <w:t xml:space="preserve"> </w:t>
+      </w:r>
+    </w:p>
+    <w:p>
+      <w:pPr>
+        <w:rPr>
+          <w:rStyle w:val="viiyi"/>
+        </w:rPr>
+      </w:pPr>
+      <w:r>
+        <w:rPr>
+          <w:rStyle w:val="jlqj4b"/>
+        </w:rPr>
+        <w:t>Par exemple, un employé qui travaille du lundi au vendredi doit être en congé le samedi et le dimanche.</w:t>
+      </w:r>
+      <w:r>
+        <w:rPr>
+          <w:rStyle w:val="viiyi"/>
+        </w:rPr>
+        <w:t xml:space="preserve"> </w:t>
+      </w:r>
+    </w:p>
+    <w:p>
+      <w:pPr>
+        <w:rPr>
+          <w:rStyle w:val="viiyi"/>
+        </w:rPr>
+      </w:pPr>
+      <w:r>
+        <w:rPr>
+          <w:rStyle w:val="jlqj4b"/>
+        </w:rPr>
+        <w:t>La poste souhaite répondre à ses besoins quotidiens en utilisant uniquement des salariés à temps plein.</w:t>
+      </w:r>
+      <w:r>
+        <w:rPr>
+          <w:rStyle w:val="viiyi"/>
+        </w:rPr>
+        <w:t xml:space="preserve"> </w:t>
+      </w:r>
+    </w:p>
+    <w:p>
+      <w:r>
+        <w:rPr>
+          <w:rStyle w:val="jlqj4b"/>
+        </w:rPr>
+        <w:t>Formulez un LP que le bureau de poste peut utiliser pour minimiser le nombre d'employés à temps plein qui doivent être embauchés.</w:t>
+      </w:r>
+    </w:p>
+    <w:p>
+      <w:pPr>
+        <w:tabs>
+          <w:tab w:val="left" w:pos="2076"/>
+        </w:tabs>
+        <w:rPr>
+          <w:rStyle w:val="jlqj4b"/>
+        </w:rPr>
+      </w:pPr>
+    </w:p>
+    <w:p>
+      <w:pPr>
+        <w:tabs>
+          <w:tab w:val="left" w:pos="2076"/>
+        </w:tabs>
+        <w:rPr>
+          <w:rStyle w:val="jlqj4b"/>
+        </w:rPr>
+      </w:pPr>
+      <w:r>
+        <w:rPr>
+          <w:noProof/>
+        </w:rPr>
+        <w:drawing>
+          <wp:inline distT="0" distB="0" distL="0" distR="0" wp14:anchorId="0AFEB092" wp14:editId="67C8870F">
+            <wp:extent cx="4095750" cy="3257550"/>
+            <wp:effectExtent l="0" t="0" r="0" b="0"/>
+            <wp:docPr id="5" name="Image 5"/>
+            <wp:cNvGraphicFramePr>
+              <a:graphicFrameLocks xmlns:a="http://schemas.openxmlformats.org/drawingml/2006/main" noChangeAspect="1"/>
+            </wp:cNvGraphicFramePr>
+            <a:graphic xmlns:a="http://schemas.openxmlformats.org/drawingml/2006/main">
+              <a:graphicData uri="http://schemas.openxmlformats.org/drawingml/2006/picture">
+                <pic:pic xmlns:pic="http://schemas.openxmlformats.org/drawingml/2006/picture">
+                  <pic:nvPicPr>
+                    <pic:cNvPr id="1" name=""/>
+                    <pic:cNvPicPr/>
+                  </pic:nvPicPr>
+                  <pic:blipFill>
+                    <a:blip r:embed="rId10"/>
+                    <a:stretch>
+                      <a:fillRect/>
+                    </a:stretch>
+                  </pic:blipFill>
+                  <pic:spPr>
+                    <a:xfrm>
+                      <a:off x="0" y="0"/>
+                      <a:ext cx="4095750" cy="3257550"/>
+                    </a:xfrm>
+                    <a:prstGeom prst="rect">
+                      <a:avLst/>
+                    </a:prstGeom>
+                  </pic:spPr>
+                </pic:pic>
+              </a:graphicData>
+            </a:graphic>
+          </wp:inline>
+        </w:drawing>
+      </w:r>
     </w:p>
     <w:p>
       <w:pPr>
@@ -5758,6 +8805,232 @@
 <file path=word/numbering.xml><?xml version="1.0" encoding="utf-8"?>
 <w:numbering xmlns:wpc="http://schemas.microsoft.com/office/word/2010/wordprocessingCanvas" xmlns:cx="http://schemas.microsoft.com/office/drawing/2014/chartex" xmlns:cx1="http://schemas.microsoft.com/office/drawing/2015/9/8/chartex" xmlns:cx2="http://schemas.microsoft.com/office/drawing/2015/10/21/chartex" xmlns:cx3="http://schemas.microsoft.com/office/drawing/2016/5/9/chartex" xmlns:cx4="http://schemas.microsoft.com/office/drawing/2016/5/10/chartex" xmlns:cx5="http://schemas.microsoft.com/office/drawing/2016/5/11/chartex" xmlns:cx6="http://schemas.microsoft.com/office/drawing/2016/5/12/chartex" xmlns:cx7="http://schemas.microsoft.com/office/drawing/2016/5/13/chartex" xmlns:cx8="http://schemas.microsoft.com/office/drawing/2016/5/14/chartex" xmlns:mc="http://schemas.openxmlformats.org/markup-compatibility/2006" xmlns:aink="http://schemas.microsoft.com/office/drawing/2016/ink" xmlns:am3d="http://schemas.microsoft.com/office/drawing/2017/model3d" xmlns:o="urn:schemas-microsoft-com:office:office" xmlns:r="http://schemas.openxmlformats.org/officeDocument/2006/relationships" xmlns:m="http://schemas.openxmlformats.org/officeDocument/2006/math" xmlns:v="urn:schemas-microsoft-com:vml" xmlns:wp14="http://schemas.microsoft.com/office/word/2010/wordprocessingDrawing" xmlns:wp="http://schemas.openxmlformats.org/drawingml/2006/wordprocessingDrawing" xmlns:w10="urn:schemas-microsoft-com:office:word" xmlns:w="http://schemas.openxmlformats.org/wordprocessingml/2006/main" xmlns:w14="http://schemas.microsoft.com/office/word/2010/wordml" xmlns:w15="http://schemas.microsoft.com/office/word/2012/wordml" xmlns:w16cex="http://schemas.microsoft.com/office/word/2018/wordml/cex" xmlns:w16cid="http://schemas.microsoft.com/office/word/2016/wordml/cid" xmlns:w16="http://schemas.microsoft.com/office/word/2018/wordml" xmlns:w16sdtdh="http://schemas.microsoft.com/office/word/2020/wordml/sdtdatahash" xmlns:w16se="http://schemas.microsoft.com/office/word/2015/wordml/symex" xmlns:wpg="http://schemas.microsoft.com/office/word/2010/wordprocessingGroup" xmlns:wpi="http://schemas.microsoft.com/office/word/2010/wordprocessingInk" xmlns:wne="http://schemas.microsoft.com/office/word/2006/wordml" xmlns:wps="http://schemas.microsoft.com/office/word/2010/wordprocessingShape" mc:Ignorable="w14 w15 w16se w16cid w16 w16cex w16sdtdh wp14">
   <w:abstractNum w:abstractNumId="0" w15:restartNumberingAfterBreak="0">
+    <w:nsid w:val="244E6AF5"/>
+    <w:multiLevelType w:val="hybridMultilevel"/>
+    <w:tmpl w:val="FDCE60AA"/>
+    <w:lvl w:ilvl="0" w:tplc="040C0001">
+      <w:start w:val="1"/>
+      <w:numFmt w:val="bullet"/>
+      <w:lvlText w:val=""/>
+      <w:lvlJc w:val="left"/>
+      <w:pPr>
+        <w:ind w:left="720" w:hanging="360"/>
+      </w:pPr>
+      <w:rPr>
+        <w:rFonts w:ascii="Symbol" w:hAnsi="Symbol" w:hint="default"/>
+      </w:rPr>
+    </w:lvl>
+    <w:lvl w:ilvl="1" w:tplc="040C0003" w:tentative="1">
+      <w:start w:val="1"/>
+      <w:numFmt w:val="bullet"/>
+      <w:lvlText w:val="o"/>
+      <w:lvlJc w:val="left"/>
+      <w:pPr>
+        <w:ind w:left="1440" w:hanging="360"/>
+      </w:pPr>
+      <w:rPr>
+        <w:rFonts w:ascii="Courier New" w:hAnsi="Courier New" w:cs="Courier New" w:hint="default"/>
+      </w:rPr>
+    </w:lvl>
+    <w:lvl w:ilvl="2" w:tplc="040C0005" w:tentative="1">
+      <w:start w:val="1"/>
+      <w:numFmt w:val="bullet"/>
+      <w:lvlText w:val=""/>
+      <w:lvlJc w:val="left"/>
+      <w:pPr>
+        <w:ind w:left="2160" w:hanging="360"/>
+      </w:pPr>
+      <w:rPr>
+        <w:rFonts w:ascii="Wingdings" w:hAnsi="Wingdings" w:hint="default"/>
+      </w:rPr>
+    </w:lvl>
+    <w:lvl w:ilvl="3" w:tplc="040C0001" w:tentative="1">
+      <w:start w:val="1"/>
+      <w:numFmt w:val="bullet"/>
+      <w:lvlText w:val=""/>
+      <w:lvlJc w:val="left"/>
+      <w:pPr>
+        <w:ind w:left="2880" w:hanging="360"/>
+      </w:pPr>
+      <w:rPr>
+        <w:rFonts w:ascii="Symbol" w:hAnsi="Symbol" w:hint="default"/>
+      </w:rPr>
+    </w:lvl>
+    <w:lvl w:ilvl="4" w:tplc="040C0003" w:tentative="1">
+      <w:start w:val="1"/>
+      <w:numFmt w:val="bullet"/>
+      <w:lvlText w:val="o"/>
+      <w:lvlJc w:val="left"/>
+      <w:pPr>
+        <w:ind w:left="3600" w:hanging="360"/>
+      </w:pPr>
+      <w:rPr>
+        <w:rFonts w:ascii="Courier New" w:hAnsi="Courier New" w:cs="Courier New" w:hint="default"/>
+      </w:rPr>
+    </w:lvl>
+    <w:lvl w:ilvl="5" w:tplc="040C0005" w:tentative="1">
+      <w:start w:val="1"/>
+      <w:numFmt w:val="bullet"/>
+      <w:lvlText w:val=""/>
+      <w:lvlJc w:val="left"/>
+      <w:pPr>
+        <w:ind w:left="4320" w:hanging="360"/>
+      </w:pPr>
+      <w:rPr>
+        <w:rFonts w:ascii="Wingdings" w:hAnsi="Wingdings" w:hint="default"/>
+      </w:rPr>
+    </w:lvl>
+    <w:lvl w:ilvl="6" w:tplc="040C0001" w:tentative="1">
+      <w:start w:val="1"/>
+      <w:numFmt w:val="bullet"/>
+      <w:lvlText w:val=""/>
+      <w:lvlJc w:val="left"/>
+      <w:pPr>
+        <w:ind w:left="5040" w:hanging="360"/>
+      </w:pPr>
+      <w:rPr>
+        <w:rFonts w:ascii="Symbol" w:hAnsi="Symbol" w:hint="default"/>
+      </w:rPr>
+    </w:lvl>
+    <w:lvl w:ilvl="7" w:tplc="040C0003" w:tentative="1">
+      <w:start w:val="1"/>
+      <w:numFmt w:val="bullet"/>
+      <w:lvlText w:val="o"/>
+      <w:lvlJc w:val="left"/>
+      <w:pPr>
+        <w:ind w:left="5760" w:hanging="360"/>
+      </w:pPr>
+      <w:rPr>
+        <w:rFonts w:ascii="Courier New" w:hAnsi="Courier New" w:cs="Courier New" w:hint="default"/>
+      </w:rPr>
+    </w:lvl>
+    <w:lvl w:ilvl="8" w:tplc="040C0005" w:tentative="1">
+      <w:start w:val="1"/>
+      <w:numFmt w:val="bullet"/>
+      <w:lvlText w:val=""/>
+      <w:lvlJc w:val="left"/>
+      <w:pPr>
+        <w:ind w:left="6480" w:hanging="360"/>
+      </w:pPr>
+      <w:rPr>
+        <w:rFonts w:ascii="Wingdings" w:hAnsi="Wingdings" w:hint="default"/>
+      </w:rPr>
+    </w:lvl>
+  </w:abstractNum>
+  <w:abstractNum w:abstractNumId="1" w15:restartNumberingAfterBreak="0">
+    <w:nsid w:val="42723F7C"/>
+    <w:multiLevelType w:val="hybridMultilevel"/>
+    <w:tmpl w:val="75E43768"/>
+    <w:lvl w:ilvl="0" w:tplc="040C0001">
+      <w:start w:val="1"/>
+      <w:numFmt w:val="bullet"/>
+      <w:lvlText w:val=""/>
+      <w:lvlJc w:val="left"/>
+      <w:pPr>
+        <w:ind w:left="720" w:hanging="360"/>
+      </w:pPr>
+      <w:rPr>
+        <w:rFonts w:ascii="Symbol" w:hAnsi="Symbol" w:hint="default"/>
+      </w:rPr>
+    </w:lvl>
+    <w:lvl w:ilvl="1" w:tplc="040C0003" w:tentative="1">
+      <w:start w:val="1"/>
+      <w:numFmt w:val="bullet"/>
+      <w:lvlText w:val="o"/>
+      <w:lvlJc w:val="left"/>
+      <w:pPr>
+        <w:ind w:left="1440" w:hanging="360"/>
+      </w:pPr>
+      <w:rPr>
+        <w:rFonts w:ascii="Courier New" w:hAnsi="Courier New" w:cs="Courier New" w:hint="default"/>
+      </w:rPr>
+    </w:lvl>
+    <w:lvl w:ilvl="2" w:tplc="040C0005" w:tentative="1">
+      <w:start w:val="1"/>
+      <w:numFmt w:val="bullet"/>
+      <w:lvlText w:val=""/>
+      <w:lvlJc w:val="left"/>
+      <w:pPr>
+        <w:ind w:left="2160" w:hanging="360"/>
+      </w:pPr>
+      <w:rPr>
+        <w:rFonts w:ascii="Wingdings" w:hAnsi="Wingdings" w:hint="default"/>
+      </w:rPr>
+    </w:lvl>
+    <w:lvl w:ilvl="3" w:tplc="040C0001" w:tentative="1">
+      <w:start w:val="1"/>
+      <w:numFmt w:val="bullet"/>
+      <w:lvlText w:val=""/>
+      <w:lvlJc w:val="left"/>
+      <w:pPr>
+        <w:ind w:left="2880" w:hanging="360"/>
+      </w:pPr>
+      <w:rPr>
+        <w:rFonts w:ascii="Symbol" w:hAnsi="Symbol" w:hint="default"/>
+      </w:rPr>
+    </w:lvl>
+    <w:lvl w:ilvl="4" w:tplc="040C0003" w:tentative="1">
+      <w:start w:val="1"/>
+      <w:numFmt w:val="bullet"/>
+      <w:lvlText w:val="o"/>
+      <w:lvlJc w:val="left"/>
+      <w:pPr>
+        <w:ind w:left="3600" w:hanging="360"/>
+      </w:pPr>
+      <w:rPr>
+        <w:rFonts w:ascii="Courier New" w:hAnsi="Courier New" w:cs="Courier New" w:hint="default"/>
+      </w:rPr>
+    </w:lvl>
+    <w:lvl w:ilvl="5" w:tplc="040C0005" w:tentative="1">
+      <w:start w:val="1"/>
+      <w:numFmt w:val="bullet"/>
+      <w:lvlText w:val=""/>
+      <w:lvlJc w:val="left"/>
+      <w:pPr>
+        <w:ind w:left="4320" w:hanging="360"/>
+      </w:pPr>
+      <w:rPr>
+        <w:rFonts w:ascii="Wingdings" w:hAnsi="Wingdings" w:hint="default"/>
+      </w:rPr>
+    </w:lvl>
+    <w:lvl w:ilvl="6" w:tplc="040C0001" w:tentative="1">
+      <w:start w:val="1"/>
+      <w:numFmt w:val="bullet"/>
+      <w:lvlText w:val=""/>
+      <w:lvlJc w:val="left"/>
+      <w:pPr>
+        <w:ind w:left="5040" w:hanging="360"/>
+      </w:pPr>
+      <w:rPr>
+        <w:rFonts w:ascii="Symbol" w:hAnsi="Symbol" w:hint="default"/>
+      </w:rPr>
+    </w:lvl>
+    <w:lvl w:ilvl="7" w:tplc="040C0003" w:tentative="1">
+      <w:start w:val="1"/>
+      <w:numFmt w:val="bullet"/>
+      <w:lvlText w:val="o"/>
+      <w:lvlJc w:val="left"/>
+      <w:pPr>
+        <w:ind w:left="5760" w:hanging="360"/>
+      </w:pPr>
+      <w:rPr>
+        <w:rFonts w:ascii="Courier New" w:hAnsi="Courier New" w:cs="Courier New" w:hint="default"/>
+      </w:rPr>
+    </w:lvl>
+    <w:lvl w:ilvl="8" w:tplc="040C0005" w:tentative="1">
+      <w:start w:val="1"/>
+      <w:numFmt w:val="bullet"/>
+      <w:lvlText w:val=""/>
+      <w:lvlJc w:val="left"/>
+      <w:pPr>
+        <w:ind w:left="6480" w:hanging="360"/>
+      </w:pPr>
+      <w:rPr>
+        <w:rFonts w:ascii="Wingdings" w:hAnsi="Wingdings" w:hint="default"/>
+      </w:rPr>
+    </w:lvl>
+  </w:abstractNum>
+  <w:abstractNum w:abstractNumId="2" w15:restartNumberingAfterBreak="0">
     <w:nsid w:val="5F881E43"/>
     <w:multiLevelType w:val="hybridMultilevel"/>
     <w:tmpl w:val="150A87BE"/>
@@ -5870,7 +9143,13 @@
     </w:lvl>
   </w:abstractNum>
   <w:num w:numId="1">
+    <w:abstractNumId w:val="2"/>
+  </w:num>
+  <w:num w:numId="2">
     <w:abstractNumId w:val="0"/>
+  </w:num>
+  <w:num w:numId="3">
+    <w:abstractNumId w:val="1"/>
   </w:num>
 </w:numbering>
 </file>
@@ -6364,7 +9643,6 @@
   <w:style w:type="character" w:default="1" w:styleId="Policepardfaut">
     <w:name w:val="Default Paragraph Font"/>
     <w:uiPriority w:val="1"/>
-    <w:semiHidden/>
     <w:unhideWhenUsed/>
   </w:style>
   <w:style w:type="table" w:default="1" w:styleId="TableauNormal">
@@ -6567,6 +9845,11 @@
       <w:ind w:left="720"/>
       <w:contextualSpacing/>
     </w:pPr>
+  </w:style>
+  <w:style w:type="character" w:customStyle="1" w:styleId="y2iqfc">
+    <w:name w:val="y2iqfc"/>
+    <w:basedOn w:val="Policepardfaut"/>
+    <w:rsid w:val="00392375"/>
   </w:style>
 </w:styles>
 </file>

</xml_diff>